<commit_message>
Fix report front matter, pagination, and figure sizing
Fill in the empty Dédicace, Remerciements, and "Vue analytique sur le
besoin" sections, move a misplaced Table des matières field back out
of the Remerciements text, add page breaks so each front-matter
section prints on its own page, fix a blank-paragraph styling bug
that was pushing the cover page onto two pages, and enlarge the
report figures to use more of the page width without losing
proportion.

Co-Authored-By: Claude Sonnet 5 <noreply@anthropic.com>
Claude-Session: https://claude.ai/code/session_01Mhfr2r2SCa9cUNB8qJ8owH
</commit_message>
<xml_diff>
--- a/docs/Rapport_Stage_NetSentry.docx
+++ b/docs/Rapport_Stage_NetSentry.docx
@@ -45,6 +45,11 @@
           <w:szCs w:val="28"/>
         </w:rPr>
       </w:pPr>
+      <w:r>
+        <w:rPr>
+          <w:sz w:val="24"/>
+        </w:rPr>
+      </w:r>
     </w:p>
     <w:p>
       <w:pPr>
@@ -105,6 +110,11 @@
           <w:szCs w:val="24"/>
         </w:rPr>
       </w:pPr>
+      <w:r>
+        <w:rPr>
+          <w:sz w:val="24"/>
+        </w:rPr>
+      </w:r>
     </w:p>
     <w:p>
       <w:pPr>
@@ -151,6 +161,11 @@
           <w:szCs w:val="24"/>
         </w:rPr>
       </w:pPr>
+      <w:r>
+        <w:rPr>
+          <w:sz w:val="24"/>
+        </w:rPr>
+      </w:r>
     </w:p>
     <w:p>
       <w:pPr>
@@ -547,6 +562,11 @@
           <w:szCs w:val="24"/>
         </w:rPr>
       </w:pPr>
+      <w:r>
+        <w:rPr>
+          <w:sz w:val="24"/>
+        </w:rPr>
+      </w:r>
     </w:p>
     <w:p>
       <w:pPr>
@@ -561,6 +581,11 @@
           <w:szCs w:val="32"/>
         </w:rPr>
       </w:pPr>
+      <w:r>
+        <w:rPr>
+          <w:sz w:val="24"/>
+        </w:rPr>
+      </w:r>
     </w:p>
     <w:p>
       <w:pPr>
@@ -575,6 +600,11 @@
           <w:szCs w:val="32"/>
         </w:rPr>
       </w:pPr>
+      <w:r>
+        <w:rPr>
+          <w:sz w:val="24"/>
+        </w:rPr>
+      </w:r>
     </w:p>
     <w:p>
       <w:pPr>
@@ -589,6 +619,11 @@
           <w:szCs w:val="32"/>
         </w:rPr>
       </w:pPr>
+      <w:r>
+        <w:rPr>
+          <w:sz w:val="24"/>
+        </w:rPr>
+      </w:r>
     </w:p>
     <w:p>
       <w:pPr>
@@ -1047,6 +1082,7 @@
     </w:p>
     <w:p>
       <w:pPr>
+        <w:jc w:val="center"/>
         <w:rPr>
           <w:rFonts w:asciiTheme="majorBidi" w:hAnsiTheme="majorBidi" w:cstheme="majorBidi"/>
           <w:sz w:val="26"/>
@@ -1056,14 +1092,49 @@
       <w:r>
         <w:rPr>
           <w:rFonts w:asciiTheme="majorBidi" w:hAnsiTheme="majorBidi" w:cstheme="majorBidi"/>
+          <w:i/>
           <w:sz w:val="26"/>
           <w:szCs w:val="26"/>
         </w:rPr>
-        <w:br w:type="page"/>
-      </w:r>
-    </w:p>
-    <w:p>
-      <w:pPr>
+        <w:t>À mes chers parents, pour leur soutien indéfectible, leurs sacrifices et leurs encouragements tout au long de mon parcours académique.</w:t>
+      </w:r>
+    </w:p>
+    <w:p>
+      <w:pPr>
+        <w:jc w:val="center"/>
+      </w:pPr>
+      <w:r>
+        <w:rPr>
+          <w:i/>
+        </w:rPr>
+        <w:t>À mes professeurs et formateurs, pour la qualité de l’enseignement transmis et pour avoir su éveiller en moi la passion du métier d’ingénieur.</w:t>
+      </w:r>
+    </w:p>
+    <w:p>
+      <w:pPr>
+        <w:jc w:val="center"/>
+      </w:pPr>
+      <w:r>
+        <w:rPr>
+          <w:i/>
+        </w:rPr>
+        <w:t>À mes proches et amis, pour leur présence et leurs encouragements constants.</w:t>
+      </w:r>
+    </w:p>
+    <w:p>
+      <w:pPr>
+        <w:jc w:val="center"/>
+      </w:pPr>
+      <w:r>
+        <w:rPr>
+          <w:i/>
+        </w:rPr>
+        <w:t>Je dédie ce modeste travail.</w:t>
+      </w:r>
+    </w:p>
+    <w:p>
+      <w:pPr>
+        <w:pageBreakBefore/>
         <w:spacing w:after="170"/>
         <w:jc w:val="center"/>
         <w:rPr>
@@ -1091,7 +1162,7 @@
     <w:p>
       <w:pPr>
         <w:spacing w:after="170"/>
-        <w:jc w:val="center"/>
+        <w:jc w:val="both"/>
         <w:rPr>
           <w:rFonts w:ascii="Brush Script MT" w:hAnsi="Brush Script MT"/>
           <w:i/>
@@ -1100,9 +1171,16 @@
           <w:szCs w:val="52"/>
         </w:rPr>
       </w:pPr>
-    </w:p>
-    <w:p>
-      <w:pPr>
+      <w:r>
+        <w:rPr>
+          <w:i w:val="0"/>
+        </w:rPr>
+        <w:t>Je tiens à exprimer mes sincères remerciements à toutes les personnes ayant contribué, de près ou de loin, à la réussite de ce stage de perfectionnement.</w:t>
+      </w:r>
+    </w:p>
+    <w:p>
+      <w:pPr>
+        <w:jc w:val="both"/>
         <w:rPr>
           <w:rFonts w:asciiTheme="majorBidi" w:hAnsiTheme="majorBidi" w:cstheme="majorBidi"/>
           <w:sz w:val="26"/>
@@ -1112,11 +1190,304 @@
       <w:r>
         <w:rPr>
           <w:rFonts w:asciiTheme="majorBidi" w:hAnsiTheme="majorBidi" w:cstheme="majorBidi"/>
+          <w:i w:val="0"/>
           <w:sz w:val="26"/>
           <w:szCs w:val="26"/>
         </w:rPr>
-        <w:br w:type="page"/>
-      </w:r>
+        <w:t>Je remercie tout particulièrement mon encadrant pédagogique au sein de l’École Marocaine des Sciences de l’Ingénieur (EMSI) pour son suivi régulier, ses conseils avisés et sa disponibilité tout au long de ce stage.</w:t>
+      </w:r>
+    </w:p>
+    <w:p>
+      <w:pPr>
+        <w:jc w:val="both"/>
+        <w:rPr>
+          <w:rFonts w:asciiTheme="majorBidi" w:hAnsiTheme="majorBidi" w:cstheme="majorBidi"/>
+          <w:sz w:val="26"/>
+          <w:szCs w:val="26"/>
+        </w:rPr>
+      </w:pPr>
+      <w:r>
+        <w:rPr>
+          <w:i w:val="0"/>
+        </w:rPr>
+        <w:t>Mes remerciements s’adressent également à l’ensemble du département Informatique du Mövenpick Hôtel de Tanger, et en particulier à mon encadrant professionnel, pour son accueil, la confiance accordée et le partage de son expérience du terrain.</w:t>
+      </w:r>
+    </w:p>
+    <w:p>
+      <w:pPr>
+        <w:jc w:val="both"/>
+        <w:rPr>
+          <w:rFonts w:asciiTheme="majorBidi" w:hAnsiTheme="majorBidi" w:cstheme="majorBidi"/>
+          <w:sz w:val="26"/>
+          <w:szCs w:val="26"/>
+        </w:rPr>
+      </w:pPr>
+      <w:r>
+        <w:rPr>
+          <w:rFonts w:asciiTheme="majorBidi" w:hAnsiTheme="majorBidi" w:cstheme="majorBidi"/>
+          <w:i w:val="0"/>
+          <w:sz w:val="26"/>
+          <w:szCs w:val="26"/>
+        </w:rPr>
+        <w:t>Je souhaite aussi remercier l’ensemble du corps professoral et administratif de l’EMSI pour la qualité de la formation dispensée durant ces années d’études.</w:t>
+      </w:r>
+    </w:p>
+    <w:p>
+      <w:pPr>
+        <w:jc w:val="both"/>
+        <w:rPr>
+          <w:rFonts w:asciiTheme="majorBidi" w:hAnsiTheme="majorBidi" w:cstheme="majorBidi"/>
+          <w:sz w:val="26"/>
+          <w:szCs w:val="26"/>
+        </w:rPr>
+      </w:pPr>
+      <w:r>
+        <w:rPr>
+          <w:i w:val="0"/>
+        </w:rPr>
+        <w:t>Enfin, je remercie ma famille et mes proches pour leur soutien constant durant cette période de stage.</w:t>
+      </w:r>
+    </w:p>
+    <w:p>
+      <w:pPr>
+        <w:pStyle w:val="NormalWeb"/>
+        <w:jc w:val="center"/>
+        <w:rPr>
+          <w:b/>
+          <w:bCs/>
+          <w:sz w:val="48"/>
+          <w:szCs w:val="48"/>
+        </w:rPr>
+      </w:pPr>
+    </w:p>
+    <w:p>
+      <w:pPr>
+        <w:pStyle w:val="NormalWeb"/>
+        <w:pageBreakBefore/>
+        <w:jc w:val="center"/>
+        <w:rPr>
+          <w:b/>
+          <w:bCs/>
+          <w:sz w:val="48"/>
+          <w:szCs w:val="48"/>
+        </w:rPr>
+      </w:pPr>
+      <w:r>
+        <w:rPr>
+          <w:b/>
+          <w:bCs/>
+          <w:sz w:val="48"/>
+          <w:szCs w:val="48"/>
+        </w:rPr>
+        <w:t>Résumé</w:t>
+      </w:r>
+    </w:p>
+    <w:p>
+      <w:pPr>
+        <w:spacing w:before="200" w:after="100"/>
+        <w:rPr>
+          <w:b/>
+          <w:bCs/>
+          <w:sz w:val="22"/>
+          <w:szCs w:val="22"/>
+        </w:rPr>
+      </w:pPr>
+      <w:r>
+        <w:rPr>
+          <w:b/>
+          <w:bCs/>
+          <w:sz w:val="22"/>
+          <w:szCs w:val="22"/>
+        </w:rPr>
+        <w:t xml:space="preserve">Contexte général</w:t>
+      </w:r>
+    </w:p>
+    <w:p>
+      <w:pPr>
+        <w:spacing w:line="360" w:lineRule="auto"/>
+        <w:ind w:right="17"/>
+        <w:jc w:val="both"/>
+      </w:pPr>
+      <w:r>
+        <w:t xml:space="preserve">Ce rapport s’inscrit dans le cadre d’un stage de perfectionnement de deux mois effectué au sein du département Informatique du Mövenpick Hôtel de Tanger. Les systèmes métiers de l’hôtel étant gérés par un prestataire externe, le département IT interne se concentre sur la gestion du réseau et des équipements informatiques.</w:t>
+      </w:r>
+    </w:p>
+    <w:p>
+      <w:pPr>
+        <w:spacing w:before="200" w:after="100"/>
+        <w:rPr>
+          <w:b/>
+          <w:bCs/>
+          <w:sz w:val="22"/>
+          <w:szCs w:val="22"/>
+        </w:rPr>
+      </w:pPr>
+      <w:r>
+        <w:rPr>
+          <w:b/>
+          <w:bCs/>
+          <w:sz w:val="22"/>
+          <w:szCs w:val="22"/>
+        </w:rPr>
+        <w:t xml:space="preserve">Objectif du projet</w:t>
+      </w:r>
+    </w:p>
+    <w:p>
+      <w:pPr>
+        <w:spacing w:line="360" w:lineRule="auto"/>
+        <w:ind w:right="17"/>
+        <w:jc w:val="both"/>
+      </w:pPr>
+      <w:r>
+        <w:t xml:space="preserve">L’objectif du projet est de développer un outil de découverte et de cartographie des équipements connectés au réseau informatique de l’hôtel, permettant de visualiser en temps réel les appareils présents et de détecter toute connexion non autorisée.</w:t>
+      </w:r>
+    </w:p>
+    <w:p>
+      <w:pPr>
+        <w:spacing w:before="200" w:after="100"/>
+        <w:rPr>
+          <w:b/>
+          <w:bCs/>
+          <w:sz w:val="22"/>
+          <w:szCs w:val="22"/>
+        </w:rPr>
+      </w:pPr>
+      <w:r>
+        <w:rPr>
+          <w:b/>
+          <w:bCs/>
+          <w:sz w:val="22"/>
+          <w:szCs w:val="22"/>
+        </w:rPr>
+        <w:t xml:space="preserve">Méthode</w:t>
+      </w:r>
+    </w:p>
+    <w:p>
+      <w:pPr>
+        <w:spacing w:line="360" w:lineRule="auto"/>
+        <w:ind w:right="17"/>
+        <w:jc w:val="both"/>
+      </w:pPr>
+      <w:r>
+        <w:t xml:space="preserve">La réalisation du projet s’appuie sur une mise à niveau sur les fondamentaux réseau, suivie du développement d’un backend, d’une base de données et d’un tableau de bord, avant la conteneurisation et le déploiement de la solution.</w:t>
+      </w:r>
+    </w:p>
+    <w:p>
+      <w:pPr>
+        <w:spacing w:before="200" w:after="100"/>
+        <w:rPr>
+          <w:b/>
+          <w:bCs/>
+          <w:sz w:val="22"/>
+          <w:szCs w:val="22"/>
+        </w:rPr>
+      </w:pPr>
+      <w:r>
+        <w:rPr>
+          <w:b/>
+          <w:bCs/>
+          <w:sz w:val="22"/>
+          <w:szCs w:val="22"/>
+        </w:rPr>
+        <w:t xml:space="preserve">Résultats</w:t>
+      </w:r>
+    </w:p>
+    <w:p>
+      <w:pPr>
+        <w:spacing w:line="360" w:lineRule="auto"/>
+        <w:ind w:right="17"/>
+        <w:jc w:val="both"/>
+      </w:pPr>
+      <w:r>
+        <w:t xml:space="preserve">Le projet est actuellement en cours de réalisation. Les résultats obtenus, ainsi que la démonstration du fonctionnement de l’outil, seront détaillés au chapitre 3 à l’issue du stage.</w:t>
+      </w:r>
+    </w:p>
+    <w:p>
+      <w:pPr>
+        <w:ind w:right="17"/>
+        <w:rPr>
+          <w:rFonts w:ascii="Segoe UI" w:hAnsi="Segoe UI" w:cs="Segoe UI"/>
+        </w:rPr>
+      </w:pPr>
+      <w:bookmarkStart w:id="0" w:name="_Toc123973260"/>
+    </w:p>
+    <w:p>
+      <w:pPr>
+        <w:pStyle w:val="NormalWeb"/>
+        <w:jc w:val="center"/>
+        <w:rPr>
+          <w:b/>
+          <w:bCs/>
+          <w:sz w:val="48"/>
+          <w:szCs w:val="48"/>
+        </w:rPr>
+      </w:pPr>
+      <w:r>
+        <w:rPr>
+          <w:b/>
+          <w:bCs/>
+          <w:sz w:val="48"/>
+          <w:szCs w:val="48"/>
+        </w:rPr>
+        <w:t>Abstract</w:t>
+      </w:r>
+    </w:p>
+    <w:p>
+      <w:pPr>
+        <w:spacing w:line="360" w:lineRule="auto"/>
+        <w:ind w:right="17"/>
+        <w:jc w:val="both"/>
+      </w:pPr>
+      <w:r>
+        <w:t xml:space="preserve">This report is part of a two-month internship carried out within the IT department of the Mövenpick Hotel in Tangier. The objective of the project is to develop a tool for discovering and mapping the devices connected to the hotel’s computer network, providing real-time visibility of connected devices and detecting unauthorized connections. The project involves learning core networking concepts, then developing a backend, a database, and a dashboard, before containerizing and deploying the solution. Results are currently in progress and will be detailed at the end of the internship.</w:t>
+      </w:r>
+    </w:p>
+    <w:p>
+      <w:pPr>
+        <w:ind w:right="17"/>
+        <w:rPr>
+          <w:rFonts w:ascii="Segoe UI" w:hAnsi="Segoe UI" w:cs="Segoe UI"/>
+        </w:rPr>
+      </w:pPr>
+    </w:p>
+    <w:bookmarkEnd w:id="0"/>
+    <w:p/>
+    <w:p>
+      <w:pPr>
+        <w:spacing w:before="120" w:line="360" w:lineRule="auto"/>
+        <w:ind w:firstLine="426"/>
+        <w:jc w:val="right"/>
+        <w:rPr>
+          <w:rFonts w:asciiTheme="majorBidi" w:hAnsiTheme="majorBidi" w:cstheme="majorBidi"/>
+          <w:sz w:val="26"/>
+          <w:szCs w:val="26"/>
+        </w:rPr>
+      </w:pPr>
+    </w:p>
+    <w:p>
+      <w:pPr>
+        <w:spacing w:before="120" w:line="360" w:lineRule="auto"/>
+        <w:ind w:firstLine="426"/>
+        <w:jc w:val="right"/>
+        <w:rPr>
+          <w:rFonts w:asciiTheme="majorBidi" w:hAnsiTheme="majorBidi" w:cstheme="majorBidi"/>
+          <w:sz w:val="26"/>
+          <w:szCs w:val="26"/>
+        </w:rPr>
+      </w:pPr>
+      <w:r>
+        <w:rPr>
+          <w:rFonts w:asciiTheme="majorBidi" w:hAnsiTheme="majorBidi" w:cstheme="majorBidi"/>
+          <w:sz w:val="26"/>
+          <w:szCs w:val="26"/>
+        </w:rPr>
+        <w:t xml:space="preserve"> </w:t>
+      </w:r>
+    </w:p>
+    <w:p>
+      <w:pPr>
+        <w:pageBreakBefore/>
+      </w:pPr>
     </w:p>
     <w:sdt>
       <w:sdtPr>
@@ -1425,276 +1796,6 @@
     </w:sdt>
     <w:p>
       <w:pPr>
-        <w:rPr>
-          <w:rFonts w:asciiTheme="majorBidi" w:hAnsiTheme="majorBidi" w:cstheme="majorBidi"/>
-          <w:sz w:val="26"/>
-          <w:szCs w:val="26"/>
-        </w:rPr>
-      </w:pPr>
-    </w:p>
-    <w:p>
-      <w:pPr>
-        <w:rPr>
-          <w:rFonts w:asciiTheme="majorBidi" w:hAnsiTheme="majorBidi" w:cstheme="majorBidi"/>
-          <w:sz w:val="26"/>
-          <w:szCs w:val="26"/>
-        </w:rPr>
-      </w:pPr>
-      <w:r>
-        <w:rPr>
-          <w:rFonts w:asciiTheme="majorBidi" w:hAnsiTheme="majorBidi" w:cstheme="majorBidi"/>
-          <w:sz w:val="26"/>
-          <w:szCs w:val="26"/>
-        </w:rPr>
-        <w:br w:type="page"/>
-      </w:r>
-    </w:p>
-    <w:p>
-      <w:pPr>
-        <w:rPr>
-          <w:rFonts w:asciiTheme="majorBidi" w:hAnsiTheme="majorBidi" w:cstheme="majorBidi"/>
-          <w:sz w:val="26"/>
-          <w:szCs w:val="26"/>
-        </w:rPr>
-      </w:pPr>
-    </w:p>
-    <w:p>
-      <w:pPr>
-        <w:pStyle w:val="NormalWeb"/>
-        <w:jc w:val="center"/>
-        <w:rPr>
-          <w:b/>
-          <w:bCs/>
-          <w:sz w:val="48"/>
-          <w:szCs w:val="48"/>
-        </w:rPr>
-      </w:pPr>
-    </w:p>
-    <w:p>
-      <w:pPr>
-        <w:pStyle w:val="NormalWeb"/>
-        <w:jc w:val="center"/>
-        <w:rPr>
-          <w:b/>
-          <w:bCs/>
-          <w:sz w:val="48"/>
-          <w:szCs w:val="48"/>
-        </w:rPr>
-      </w:pPr>
-      <w:r>
-        <w:rPr>
-          <w:b/>
-          <w:bCs/>
-          <w:sz w:val="48"/>
-          <w:szCs w:val="48"/>
-        </w:rPr>
-        <w:t>Résumé</w:t>
-      </w:r>
-    </w:p>
-    <w:p>
-      <w:pPr>
-        <w:spacing w:before="200" w:after="100"/>
-        <w:rPr>
-          <w:b/>
-          <w:bCs/>
-          <w:sz w:val="22"/>
-          <w:szCs w:val="22"/>
-        </w:rPr>
-      </w:pPr>
-      <w:r>
-        <w:rPr>
-          <w:b/>
-          <w:bCs/>
-          <w:sz w:val="22"/>
-          <w:szCs w:val="22"/>
-        </w:rPr>
-        <w:t xml:space="preserve">Contexte général</w:t>
-      </w:r>
-    </w:p>
-    <w:p>
-      <w:pPr>
-        <w:spacing w:line="360" w:lineRule="auto"/>
-        <w:ind w:right="17"/>
-        <w:jc w:val="both"/>
-      </w:pPr>
-      <w:r>
-        <w:t xml:space="preserve">Ce rapport s’inscrit dans le cadre d’un stage de perfectionnement de deux mois effectué au sein du département Informatique du Mövenpick Hôtel de Tanger. Les systèmes métiers de l’hôtel étant gérés par un prestataire externe, le département IT interne se concentre sur la gestion du réseau et des équipements informatiques.</w:t>
-      </w:r>
-    </w:p>
-    <w:p>
-      <w:pPr>
-        <w:spacing w:before="200" w:after="100"/>
-        <w:rPr>
-          <w:b/>
-          <w:bCs/>
-          <w:sz w:val="22"/>
-          <w:szCs w:val="22"/>
-        </w:rPr>
-      </w:pPr>
-      <w:r>
-        <w:rPr>
-          <w:b/>
-          <w:bCs/>
-          <w:sz w:val="22"/>
-          <w:szCs w:val="22"/>
-        </w:rPr>
-        <w:t xml:space="preserve">Objectif du projet</w:t>
-      </w:r>
-    </w:p>
-    <w:p>
-      <w:pPr>
-        <w:spacing w:line="360" w:lineRule="auto"/>
-        <w:ind w:right="17"/>
-        <w:jc w:val="both"/>
-      </w:pPr>
-      <w:r>
-        <w:t xml:space="preserve">L’objectif du projet est de développer un outil de découverte et de cartographie des équipements connectés au réseau informatique de l’hôtel, permettant de visualiser en temps réel les appareils présents et de détecter toute connexion non autorisée.</w:t>
-      </w:r>
-    </w:p>
-    <w:p>
-      <w:pPr>
-        <w:spacing w:before="200" w:after="100"/>
-        <w:rPr>
-          <w:b/>
-          <w:bCs/>
-          <w:sz w:val="22"/>
-          <w:szCs w:val="22"/>
-        </w:rPr>
-      </w:pPr>
-      <w:r>
-        <w:rPr>
-          <w:b/>
-          <w:bCs/>
-          <w:sz w:val="22"/>
-          <w:szCs w:val="22"/>
-        </w:rPr>
-        <w:t xml:space="preserve">Méthode</w:t>
-      </w:r>
-    </w:p>
-    <w:p>
-      <w:pPr>
-        <w:spacing w:line="360" w:lineRule="auto"/>
-        <w:ind w:right="17"/>
-        <w:jc w:val="both"/>
-      </w:pPr>
-      <w:r>
-        <w:t xml:space="preserve">La réalisation du projet s’appuie sur une mise à niveau sur les fondamentaux réseau, suivie du développement d’un backend, d’une base de données et d’un tableau de bord, avant la conteneurisation et le déploiement de la solution.</w:t>
-      </w:r>
-    </w:p>
-    <w:p>
-      <w:pPr>
-        <w:spacing w:before="200" w:after="100"/>
-        <w:rPr>
-          <w:b/>
-          <w:bCs/>
-          <w:sz w:val="22"/>
-          <w:szCs w:val="22"/>
-        </w:rPr>
-      </w:pPr>
-      <w:r>
-        <w:rPr>
-          <w:b/>
-          <w:bCs/>
-          <w:sz w:val="22"/>
-          <w:szCs w:val="22"/>
-        </w:rPr>
-        <w:t xml:space="preserve">Résultats</w:t>
-      </w:r>
-    </w:p>
-    <w:p>
-      <w:pPr>
-        <w:spacing w:line="360" w:lineRule="auto"/>
-        <w:ind w:right="17"/>
-        <w:jc w:val="both"/>
-      </w:pPr>
-      <w:r>
-        <w:t xml:space="preserve">Le projet est actuellement en cours de réalisation. Les résultats obtenus, ainsi que la démonstration du fonctionnement de l’outil, seront détaillés au chapitre 3 à l’issue du stage.</w:t>
-      </w:r>
-    </w:p>
-    <w:p>
-      <w:pPr>
-        <w:ind w:right="17"/>
-        <w:rPr>
-          <w:rFonts w:ascii="Segoe UI" w:hAnsi="Segoe UI" w:cs="Segoe UI"/>
-        </w:rPr>
-      </w:pPr>
-      <w:bookmarkStart w:id="0" w:name="_Toc123973260"/>
-    </w:p>
-    <w:p>
-      <w:pPr>
-        <w:pStyle w:val="NormalWeb"/>
-        <w:jc w:val="center"/>
-        <w:rPr>
-          <w:b/>
-          <w:bCs/>
-          <w:sz w:val="48"/>
-          <w:szCs w:val="48"/>
-        </w:rPr>
-      </w:pPr>
-      <w:r>
-        <w:rPr>
-          <w:b/>
-          <w:bCs/>
-          <w:sz w:val="48"/>
-          <w:szCs w:val="48"/>
-        </w:rPr>
-        <w:t>Abstract</w:t>
-      </w:r>
-    </w:p>
-    <w:p>
-      <w:pPr>
-        <w:spacing w:line="360" w:lineRule="auto"/>
-        <w:ind w:right="17"/>
-        <w:jc w:val="both"/>
-      </w:pPr>
-      <w:r>
-        <w:t xml:space="preserve">This report is part of a two-month internship carried out within the IT department of the Mövenpick Hotel in Tangier. The objective of the project is to develop a tool for discovering and mapping the devices connected to the hotel’s computer network, providing real-time visibility of connected devices and detecting unauthorized connections. The project involves learning core networking concepts, then developing a backend, a database, and a dashboard, before containerizing and deploying the solution. Results are currently in progress and will be detailed at the end of the internship.</w:t>
-      </w:r>
-    </w:p>
-    <w:p>
-      <w:pPr>
-        <w:ind w:right="17"/>
-        <w:rPr>
-          <w:rFonts w:ascii="Segoe UI" w:hAnsi="Segoe UI" w:cs="Segoe UI"/>
-        </w:rPr>
-      </w:pPr>
-    </w:p>
-    <w:bookmarkEnd w:id="0"/>
-    <w:p/>
-    <w:p>
-      <w:pPr>
-        <w:spacing w:before="120" w:line="360" w:lineRule="auto"/>
-        <w:ind w:firstLine="426"/>
-        <w:jc w:val="right"/>
-        <w:rPr>
-          <w:rFonts w:asciiTheme="majorBidi" w:hAnsiTheme="majorBidi" w:cstheme="majorBidi"/>
-          <w:sz w:val="26"/>
-          <w:szCs w:val="26"/>
-        </w:rPr>
-      </w:pPr>
-    </w:p>
-    <w:p>
-      <w:pPr>
-        <w:spacing w:before="120" w:line="360" w:lineRule="auto"/>
-        <w:ind w:firstLine="426"/>
-        <w:jc w:val="right"/>
-        <w:rPr>
-          <w:rFonts w:asciiTheme="majorBidi" w:hAnsiTheme="majorBidi" w:cstheme="majorBidi"/>
-          <w:sz w:val="26"/>
-          <w:szCs w:val="26"/>
-        </w:rPr>
-      </w:pPr>
-      <w:r>
-        <w:rPr>
-          <w:rFonts w:asciiTheme="majorBidi" w:hAnsiTheme="majorBidi" w:cstheme="majorBidi"/>
-          <w:sz w:val="26"/>
-          <w:szCs w:val="26"/>
-        </w:rPr>
-        <w:t xml:space="preserve"> </w:t>
-      </w:r>
-    </w:p>
-    <w:p>
-      <w:pPr>
         <w:spacing w:line="320" w:lineRule="exact"/>
         <w:ind w:right="17"/>
         <w:jc w:val="both"/>
@@ -2862,6 +2963,39 @@
     </w:p>
     <w:p>
       <w:pPr>
+        <w:jc w:val="both"/>
+      </w:pPr>
+      <w:r>
+        <w:rPr>
+          <w:i w:val="0"/>
+        </w:rPr>
+        <w:t>Avant le déploiement de NetSentry, le département IT du Mövenpick Hôtel de Tanger ne disposait d’aucun inventaire fiable des équipements connectés au réseau local : postes de travail, imprimantes, caméras, bornes Wi-Fi et appareils invités se multiplient sans qu’aucun outil ne permette de savoir, à un instant donné, combien d’appareils sont actifs, ni d’identifier une connexion inhabituelle ou non autorisée.</w:t>
+      </w:r>
+    </w:p>
+    <w:p>
+      <w:pPr>
+        <w:jc w:val="both"/>
+      </w:pPr>
+      <w:r>
+        <w:rPr>
+          <w:i w:val="0"/>
+        </w:rPr>
+        <w:t>L’analyse du besoin a permis de dégager trois exigences fonctionnelles principales : découvrir automatiquement les équipements présents sur le réseau et les identifier (adresse IP, adresse MAC, fabricant, ports ouverts) ; conserver un historique des détections afin de suivre l’apparition et la disparition des appareils dans le temps ; et signaler tout appareil détecté pour la première fois, afin que l’administrateur IT puisse le vérifier et, le cas échéant, le classer comme connu.</w:t>
+      </w:r>
+    </w:p>
+    <w:p>
+      <w:pPr>
+        <w:jc w:val="both"/>
+      </w:pPr>
+      <w:r>
+        <w:rPr>
+          <w:i w:val="0"/>
+        </w:rPr>
+        <w:t>Sur le plan non fonctionnel, la solution devait rester simple d’utilisation pour du personnel non spécialisé en réseau, s’exécuter de manière autonome (scans planifiés) sans intervention manuelle systématique, et ne transmettre aucune donnée du réseau interne vers des services externes. Ces contraintes ont directement guidé les choix d’architecture et de conception détaillés dans les sections suivantes.</w:t>
+      </w:r>
+    </w:p>
+    <w:p>
+      <w:pPr>
         <w:spacing w:before="200" w:after="100"/>
         <w:rPr>
           <w:b/>
@@ -2882,6 +3016,7 @@
     </w:p>
     <w:p>
       <w:pPr>
+        <w:keepNext/>
         <w:spacing w:line="360" w:lineRule="auto"/>
         <w:ind w:right="17"/>
         <w:jc w:val="both"/>
@@ -2897,9 +3032,64 @@
           <w:iCs/>
           <w:color w:val="595959"/>
         </w:rPr>
-        <w:t xml:space="preserve">Cette section présentera un schéma illustrant l’intégration de l’outil (scanner, backend, base de données, tableau de bord) au sein du réseau de l’hôtel.</w:t>
-      </w:r>
-    </w:p>
+        <w:t>Le schéma ci-dessous illustre l’intégration de NetSentry au sein du réseau local de l’hôtel : le scanner Nmap interroge périodiquement les appareils connectés au commutateur réseau (découverte ARP et énumération des ports), le backend Node.js persiste les résultats dans PostgreSQL, et le tableau de bord React est consulté par l’administrateur IT depuis son navigateur.</w:t>
+      </w:r>
+    </w:p>
+    <w:p>
+      <w:pPr>
+        <w:keepNext/>
+        <w:spacing w:before="120"/>
+        <w:jc w:val="center"/>
+      </w:pPr>
+      <w:r>
+        <w:drawing>
+          <wp:inline xmlns:a="http://schemas.openxmlformats.org/drawingml/2006/main" xmlns:pic="http://schemas.openxmlformats.org/drawingml/2006/picture">
+            <wp:extent cx="5257800" cy="3549569"/>
+            <wp:docPr id="2088770733" name="Picture 2088770733"/>
+            <wp:cNvGraphicFramePr>
+              <a:graphicFrameLocks noChangeAspect="1"/>
+            </wp:cNvGraphicFramePr>
+            <a:graphic>
+              <a:graphicData uri="http://schemas.openxmlformats.org/drawingml/2006/picture">
+                <pic:pic>
+                  <pic:nvPicPr>
+                    <pic:cNvPr id="0" name="fig0-architecture.png"/>
+                    <pic:cNvPicPr/>
+                  </pic:nvPicPr>
+                  <pic:blipFill>
+                    <a:blip r:embed="rId28"/>
+                    <a:stretch>
+                      <a:fillRect/>
+                    </a:stretch>
+                  </pic:blipFill>
+                  <pic:spPr>
+                    <a:xfrm>
+                      <a:off x="0" y="0"/>
+                      <a:ext cx="5257800" cy="3549569"/>
+                    </a:xfrm>
+                    <a:prstGeom prst="rect"/>
+                  </pic:spPr>
+                </pic:pic>
+              </a:graphicData>
+            </a:graphic>
+          </wp:inline>
+        </w:drawing>
+      </w:r>
+    </w:p>
+    <w:p>
+      <w:pPr>
+        <w:spacing w:after="280"/>
+        <w:jc w:val="center"/>
+      </w:pPr>
+      <w:r>
+        <w:rPr>
+          <w:i/>
+          <w:sz w:val="20"/>
+        </w:rPr>
+        <w:t>Figure 1 – Schéma d’intégration de NetSentry dans le réseau local de l’hôtel.</w:t>
+      </w:r>
+    </w:p>
+    <w:p/>
     <w:p>
       <w:pPr>
         <w:spacing w:before="200" w:after="100"/>
@@ -2922,6 +3112,7 @@
     </w:p>
     <w:p>
       <w:pPr>
+        <w:keepNext/>
         <w:spacing w:line="360" w:lineRule="auto"/>
         <w:ind w:right="17"/>
         <w:jc w:val="both"/>
@@ -2937,17 +3128,18 @@
           <w:iCs/>
           <w:color w:val="595959"/>
         </w:rPr>
-        <w:t xml:space="preserve">Cette section présentera les acteurs du système ainsi que les diagrammes de cas d’utilisation et de séquence modélisant leurs interactions avec l’outil.</w:t>
-      </w:r>
-    </w:p>
-    <w:p>
-      <w:pPr>
+        <w:t>Le système NetSentry expose un seul rôle applicatif : un administrateur IT authentifié pilote le tableau de bord, déclenche les scans et traite les alertes, tandis qu’un acteur système (l’ordonnanceur cron) déclenche automatiquement les scans planifiés. Les figures 2 et 3 détaillent respectivement les cas d’utilisation du système et le déroulement complet d’un scan, de son déclenchement jusqu’à la détection d’une éventuelle anomalie.</w:t>
+      </w:r>
+    </w:p>
+    <w:p>
+      <w:pPr>
+        <w:keepNext/>
         <w:jc w:val="center"/>
       </w:pPr>
       <w:r>
         <w:drawing>
           <wp:inline xmlns:a="http://schemas.openxmlformats.org/drawingml/2006/main" xmlns:pic="http://schemas.openxmlformats.org/drawingml/2006/picture">
-            <wp:extent cx="5120640" cy="3756131"/>
+            <wp:extent cx="5257800" cy="3856741"/>
             <wp:docPr id="2088770730" name="Picture 2088770730"/>
             <wp:cNvGraphicFramePr>
               <a:graphicFrameLocks noChangeAspect="1"/>
@@ -2968,7 +3160,7 @@
                   <pic:spPr>
                     <a:xfrm>
                       <a:off x="0" y="0"/>
-                      <a:ext cx="5120640" cy="3756131"/>
+                      <a:ext cx="5257800" cy="3856741"/>
                     </a:xfrm>
                     <a:prstGeom prst="rect"/>
                   </pic:spPr>
@@ -2981,6 +3173,7 @@
     </w:p>
     <w:p>
       <w:pPr>
+        <w:spacing w:after="280"/>
         <w:jc w:val="center"/>
       </w:pPr>
       <w:r>
@@ -2988,18 +3181,19 @@
           <w:i/>
           <w:sz w:val="20"/>
         </w:rPr>
-        <w:t>Figure 1 – Diagramme de cas d’utilisation de NetSentry.</w:t>
+        <w:t>Figure 2 – Diagramme de cas d’utilisation de NetSentry.</w:t>
       </w:r>
     </w:p>
     <w:p/>
     <w:p>
       <w:pPr>
+        <w:keepNext/>
         <w:jc w:val="center"/>
       </w:pPr>
       <w:r>
         <w:drawing>
           <wp:inline xmlns:a="http://schemas.openxmlformats.org/drawingml/2006/main" xmlns:pic="http://schemas.openxmlformats.org/drawingml/2006/picture">
-            <wp:extent cx="5120640" cy="5010169"/>
+            <wp:extent cx="5257800" cy="5144369"/>
             <wp:docPr id="2088770731" name="Picture 2088770731"/>
             <wp:cNvGraphicFramePr>
               <a:graphicFrameLocks noChangeAspect="1"/>
@@ -3020,7 +3214,7 @@
                   <pic:spPr>
                     <a:xfrm>
                       <a:off x="0" y="0"/>
-                      <a:ext cx="5120640" cy="5010169"/>
+                      <a:ext cx="5257800" cy="5144369"/>
                     </a:xfrm>
                     <a:prstGeom prst="rect"/>
                   </pic:spPr>
@@ -3033,6 +3227,7 @@
     </w:p>
     <w:p>
       <w:pPr>
+        <w:spacing w:after="280"/>
         <w:jc w:val="center"/>
       </w:pPr>
       <w:r>
@@ -3040,7 +3235,7 @@
           <w:i/>
           <w:sz w:val="20"/>
         </w:rPr>
-        <w:t>Figure 2 – Diagramme de séquence : exécution d’un scan et détection d’une anomalie.</w:t>
+        <w:t>Figure 3 – Diagramme de séquence : exécution d’un scan et détection d’une anomalie.</w:t>
       </w:r>
     </w:p>
     <w:p/>
@@ -3089,6 +3284,7 @@
     </w:p>
     <w:p>
       <w:pPr>
+        <w:keepNext/>
         <w:spacing w:line="360" w:lineRule="auto"/>
         <w:ind w:right="17"/>
         <w:jc w:val="both"/>
@@ -3104,17 +3300,18 @@
           <w:iCs/>
           <w:color w:val="595959"/>
         </w:rPr>
-        <w:t xml:space="preserve">Cette section présentera le modèle conceptuel de données (MCD) définissant les entités et relations utilisées pour stocker l’historique des équipements détectés.</w:t>
-      </w:r>
-    </w:p>
-    <w:p>
-      <w:pPr>
+        <w:t>Le modèle conceptuel de données ci-dessous (Fig. 4) définit les entités et relations utilisées pour stocker l’historique des équipements détectés, conformément au schéma implémenté dans PostgreSQL. Les appareils sont identifiés par leur adresse MAC — stable dans le temps, contrairement à l’adresse IP attribuée par DHCP — et chaque scan produit une association DÉTECTION qui constitue l’historique consultable dans le tableau de bord.</w:t>
+      </w:r>
+    </w:p>
+    <w:p>
+      <w:pPr>
+        <w:keepNext/>
         <w:jc w:val="center"/>
       </w:pPr>
       <w:r>
         <w:drawing>
           <wp:inline xmlns:a="http://schemas.openxmlformats.org/drawingml/2006/main" xmlns:pic="http://schemas.openxmlformats.org/drawingml/2006/picture">
-            <wp:extent cx="5120640" cy="4169328"/>
+            <wp:extent cx="5257800" cy="4281006"/>
             <wp:docPr id="2088770732" name="Picture 2088770732"/>
             <wp:cNvGraphicFramePr>
               <a:graphicFrameLocks noChangeAspect="1"/>
@@ -3135,7 +3332,7 @@
                   <pic:spPr>
                     <a:xfrm>
                       <a:off x="0" y="0"/>
-                      <a:ext cx="5120640" cy="4169328"/>
+                      <a:ext cx="5257800" cy="4281006"/>
                     </a:xfrm>
                     <a:prstGeom prst="rect"/>
                   </pic:spPr>
@@ -3148,6 +3345,7 @@
     </w:p>
     <w:p>
       <w:pPr>
+        <w:spacing w:after="280"/>
         <w:jc w:val="center"/>
       </w:pPr>
       <w:r>
@@ -3155,7 +3353,7 @@
           <w:i/>
           <w:sz w:val="20"/>
         </w:rPr>
-        <w:t>Figure 3 – Modèle conceptuel de données (MCD) de NetSentry.</w:t>
+        <w:t>Figure 4 – Modèle conceptuel de données (MCD) de NetSentry.</w:t>
       </w:r>
     </w:p>
     <w:p/>
@@ -3287,6 +3485,7 @@
     </w:p>
     <w:p>
       <w:pPr>
+        <w:keepNext/>
         <w:spacing w:line="360" w:lineRule="auto"/>
         <w:ind w:right="17"/>
         <w:jc w:val="both"/>
@@ -3302,9 +3501,229 @@
           <w:iCs/>
           <w:color w:val="595959"/>
         </w:rPr>
-        <w:t xml:space="preserve">Cette section présentera, captures d’écran à l’appui, le fonctionnement de l’outil une fois développé.</w:t>
-      </w:r>
-    </w:p>
+        <w:t>Les captures d’écran suivantes illustrent le fonctionnement réel de l’outil, à partir d’un scan effectué sur un réseau local de test : le tableau de bord présente l’ensemble des appareils détectés avec leur statut, le détail d’un appareil retrace son historique de détection, la page des alertes signale les appareils non reconnus, et l’historique des scans conserve la trace de chaque exécution.</w:t>
+      </w:r>
+    </w:p>
+    <w:p>
+      <w:pPr>
+        <w:keepNext/>
+        <w:spacing w:before="120"/>
+        <w:jc w:val="center"/>
+      </w:pPr>
+      <w:r>
+        <w:drawing>
+          <wp:inline xmlns:a="http://schemas.openxmlformats.org/drawingml/2006/main" xmlns:pic="http://schemas.openxmlformats.org/drawingml/2006/picture">
+            <wp:extent cx="5257800" cy="2512060"/>
+            <wp:docPr id="2088770734" name="Picture 2088770734"/>
+            <wp:cNvGraphicFramePr>
+              <a:graphicFrameLocks noChangeAspect="1"/>
+            </wp:cNvGraphicFramePr>
+            <a:graphic>
+              <a:graphicData uri="http://schemas.openxmlformats.org/drawingml/2006/picture">
+                <pic:pic>
+                  <pic:nvPicPr>
+                    <pic:cNvPr id="0" name="fig-dashboard.png"/>
+                    <pic:cNvPicPr/>
+                  </pic:nvPicPr>
+                  <pic:blipFill>
+                    <a:blip r:embed="rId29"/>
+                    <a:stretch>
+                      <a:fillRect/>
+                    </a:stretch>
+                  </pic:blipFill>
+                  <pic:spPr>
+                    <a:xfrm>
+                      <a:off x="0" y="0"/>
+                      <a:ext cx="5257800" cy="2512060"/>
+                    </a:xfrm>
+                    <a:prstGeom prst="rect"/>
+                  </pic:spPr>
+                </pic:pic>
+              </a:graphicData>
+            </a:graphic>
+          </wp:inline>
+        </w:drawing>
+      </w:r>
+    </w:p>
+    <w:p>
+      <w:pPr>
+        <w:spacing w:after="280"/>
+        <w:jc w:val="center"/>
+      </w:pPr>
+      <w:r>
+        <w:rPr>
+          <w:i/>
+          <w:sz w:val="20"/>
+        </w:rPr>
+        <w:t>Figure 5 – Tableau de bord : vue d’ensemble des appareils détectés sur le réseau.</w:t>
+      </w:r>
+    </w:p>
+    <w:p/>
+    <w:p>
+      <w:pPr>
+        <w:keepNext/>
+        <w:spacing w:before="120"/>
+        <w:jc w:val="center"/>
+      </w:pPr>
+      <w:r>
+        <w:drawing>
+          <wp:inline xmlns:a="http://schemas.openxmlformats.org/drawingml/2006/main" xmlns:pic="http://schemas.openxmlformats.org/drawingml/2006/picture">
+            <wp:extent cx="5257800" cy="2077561"/>
+            <wp:docPr id="2088770735" name="Picture 2088770735"/>
+            <wp:cNvGraphicFramePr>
+              <a:graphicFrameLocks noChangeAspect="1"/>
+            </wp:cNvGraphicFramePr>
+            <a:graphic>
+              <a:graphicData uri="http://schemas.openxmlformats.org/drawingml/2006/picture">
+                <pic:pic>
+                  <pic:nvPicPr>
+                    <pic:cNvPr id="0" name="fig-device-detail.png"/>
+                    <pic:cNvPicPr/>
+                  </pic:nvPicPr>
+                  <pic:blipFill>
+                    <a:blip r:embed="rId30"/>
+                    <a:stretch>
+                      <a:fillRect/>
+                    </a:stretch>
+                  </pic:blipFill>
+                  <pic:spPr>
+                    <a:xfrm>
+                      <a:off x="0" y="0"/>
+                      <a:ext cx="5257800" cy="2077561"/>
+                    </a:xfrm>
+                    <a:prstGeom prst="rect"/>
+                  </pic:spPr>
+                </pic:pic>
+              </a:graphicData>
+            </a:graphic>
+          </wp:inline>
+        </w:drawing>
+      </w:r>
+    </w:p>
+    <w:p>
+      <w:pPr>
+        <w:spacing w:after="280"/>
+        <w:jc w:val="center"/>
+      </w:pPr>
+      <w:r>
+        <w:rPr>
+          <w:i/>
+          <w:sz w:val="20"/>
+        </w:rPr>
+        <w:t>Figure 6 – Détail d’un appareil : historique de détection et mise en liste blanche.</w:t>
+      </w:r>
+    </w:p>
+    <w:p/>
+    <w:p>
+      <w:pPr>
+        <w:keepNext/>
+        <w:spacing w:before="120"/>
+        <w:jc w:val="center"/>
+      </w:pPr>
+      <w:r>
+        <w:drawing>
+          <wp:inline xmlns:a="http://schemas.openxmlformats.org/drawingml/2006/main" xmlns:pic="http://schemas.openxmlformats.org/drawingml/2006/picture">
+            <wp:extent cx="5257800" cy="2555875"/>
+            <wp:docPr id="2088770736" name="Picture 2088770736"/>
+            <wp:cNvGraphicFramePr>
+              <a:graphicFrameLocks noChangeAspect="1"/>
+            </wp:cNvGraphicFramePr>
+            <a:graphic>
+              <a:graphicData uri="http://schemas.openxmlformats.org/drawingml/2006/picture">
+                <pic:pic>
+                  <pic:nvPicPr>
+                    <pic:cNvPr id="0" name="fig-alerts.png"/>
+                    <pic:cNvPicPr/>
+                  </pic:nvPicPr>
+                  <pic:blipFill>
+                    <a:blip r:embed="rId31"/>
+                    <a:stretch>
+                      <a:fillRect/>
+                    </a:stretch>
+                  </pic:blipFill>
+                  <pic:spPr>
+                    <a:xfrm>
+                      <a:off x="0" y="0"/>
+                      <a:ext cx="5257800" cy="2555875"/>
+                    </a:xfrm>
+                    <a:prstGeom prst="rect"/>
+                  </pic:spPr>
+                </pic:pic>
+              </a:graphicData>
+            </a:graphic>
+          </wp:inline>
+        </w:drawing>
+      </w:r>
+    </w:p>
+    <w:p>
+      <w:pPr>
+        <w:spacing w:after="280"/>
+        <w:jc w:val="center"/>
+      </w:pPr>
+      <w:r>
+        <w:rPr>
+          <w:i/>
+          <w:sz w:val="20"/>
+        </w:rPr>
+        <w:t>Figure 7 – Alertes : appareils non reconnus signalés après un scan.</w:t>
+      </w:r>
+    </w:p>
+    <w:p/>
+    <w:p>
+      <w:pPr>
+        <w:keepNext/>
+        <w:spacing w:before="120"/>
+        <w:jc w:val="center"/>
+      </w:pPr>
+      <w:r>
+        <w:drawing>
+          <wp:inline xmlns:a="http://schemas.openxmlformats.org/drawingml/2006/main" xmlns:pic="http://schemas.openxmlformats.org/drawingml/2006/picture">
+            <wp:extent cx="5257800" cy="1559083"/>
+            <wp:docPr id="2088770737" name="Picture 2088770737"/>
+            <wp:cNvGraphicFramePr>
+              <a:graphicFrameLocks noChangeAspect="1"/>
+            </wp:cNvGraphicFramePr>
+            <a:graphic>
+              <a:graphicData uri="http://schemas.openxmlformats.org/drawingml/2006/picture">
+                <pic:pic>
+                  <pic:nvPicPr>
+                    <pic:cNvPr id="0" name="fig-scans.png"/>
+                    <pic:cNvPicPr/>
+                  </pic:nvPicPr>
+                  <pic:blipFill>
+                    <a:blip r:embed="rId32"/>
+                    <a:stretch>
+                      <a:fillRect/>
+                    </a:stretch>
+                  </pic:blipFill>
+                  <pic:spPr>
+                    <a:xfrm>
+                      <a:off x="0" y="0"/>
+                      <a:ext cx="5257800" cy="1559083"/>
+                    </a:xfrm>
+                    <a:prstGeom prst="rect"/>
+                  </pic:spPr>
+                </pic:pic>
+              </a:graphicData>
+            </a:graphic>
+          </wp:inline>
+        </w:drawing>
+      </w:r>
+    </w:p>
+    <w:p>
+      <w:pPr>
+        <w:spacing w:after="280"/>
+        <w:jc w:val="center"/>
+      </w:pPr>
+      <w:r>
+        <w:rPr>
+          <w:i/>
+          <w:sz w:val="20"/>
+        </w:rPr>
+        <w:t>Figure 8 – Historique des scans exécutés (manuels et planifiés).</w:t>
+      </w:r>
+    </w:p>
+    <w:p/>
     <w:p>
       <w:pPr>
         <w:spacing w:before="200" w:after="100"/>
@@ -3327,6 +3746,7 @@
     </w:p>
     <w:p>
       <w:pPr>
+        <w:keepNext/>
         <w:spacing w:line="360" w:lineRule="auto"/>
         <w:ind w:right="17"/>
         <w:jc w:val="both"/>
@@ -3342,9 +3762,64 @@
           <w:iCs/>
           <w:color w:val="595959"/>
         </w:rPr>
-        <w:t xml:space="preserve">Cette section présentera l’historique de développement du projet à travers Git.</w:t>
-      </w:r>
-    </w:p>
+        <w:t>Le projet est versionné avec Git et hébergé sur un dépôt GitHub public. L’historique reste volontairement synthétique à ce stade du stage : un commit initial, l’ajout des documents de cadrage, puis un commit unique regroupant la construction du MVP (backend, frontend, conteneurisation). Il sera affiné par des commits plus granulaires au fil des prochaines itérations.</w:t>
+      </w:r>
+    </w:p>
+    <w:p>
+      <w:pPr>
+        <w:keepNext/>
+        <w:spacing w:before="120"/>
+        <w:jc w:val="center"/>
+      </w:pPr>
+      <w:r>
+        <w:drawing>
+          <wp:inline xmlns:a="http://schemas.openxmlformats.org/drawingml/2006/main" xmlns:pic="http://schemas.openxmlformats.org/drawingml/2006/picture">
+            <wp:extent cx="5257800" cy="2681477"/>
+            <wp:docPr id="2088770738" name="Picture 2088770738"/>
+            <wp:cNvGraphicFramePr>
+              <a:graphicFrameLocks noChangeAspect="1"/>
+            </wp:cNvGraphicFramePr>
+            <a:graphic>
+              <a:graphicData uri="http://schemas.openxmlformats.org/drawingml/2006/picture">
+                <pic:pic>
+                  <pic:nvPicPr>
+                    <pic:cNvPr id="0" name="fig-github.png"/>
+                    <pic:cNvPicPr/>
+                  </pic:nvPicPr>
+                  <pic:blipFill>
+                    <a:blip r:embed="rId33"/>
+                    <a:stretch>
+                      <a:fillRect/>
+                    </a:stretch>
+                  </pic:blipFill>
+                  <pic:spPr>
+                    <a:xfrm>
+                      <a:off x="0" y="0"/>
+                      <a:ext cx="5257800" cy="2681477"/>
+                    </a:xfrm>
+                    <a:prstGeom prst="rect"/>
+                  </pic:spPr>
+                </pic:pic>
+              </a:graphicData>
+            </a:graphic>
+          </wp:inline>
+        </w:drawing>
+      </w:r>
+    </w:p>
+    <w:p>
+      <w:pPr>
+        <w:spacing w:after="280"/>
+        <w:jc w:val="center"/>
+      </w:pPr>
+      <w:r>
+        <w:rPr>
+          <w:i/>
+          <w:sz w:val="20"/>
+        </w:rPr>
+        <w:t>Figure 9 – Historique des commits du dépôt GitHub NetSentry.</w:t>
+      </w:r>
+    </w:p>
+    <w:p/>
     <w:p>
       <w:pPr>
         <w:spacing w:before="200" w:after="100"/>

</xml_diff>

<commit_message>
Restructure report into 4 chapters: merge company/dept into Ch1, add Méthodologie de travail (Ch2, incl. cahier des charges), Modélisation et diagrammes (Ch3, incl. new Gantt and Kanban figures), and Captures d'écran (Ch4). Renumber figures and update cross-references accordingly.
Co-Authored-By: Claude Sonnet 5 <noreply@anthropic.com>
Claude-Session: https://claude.ai/code/session_01MsyBYY5gbLdusFArFTtsmW
</commit_message>
<xml_diff>
--- a/docs/Rapport_Stage_NetSentry.docx
+++ b/docs/Rapport_Stage_NetSentry.docx
@@ -1399,7 +1399,7 @@
         <w:jc w:val="both"/>
       </w:pPr>
       <w:r>
-        <w:t xml:space="preserve">Le projet est actuellement en cours de réalisation. Les résultats obtenus, ainsi que la démonstration du fonctionnement de l’outil, seront détaillés au chapitre 3 à l’issue du stage.</w:t>
+        <w:t>Le projet est actuellement en cours de réalisation. Les résultats obtenus, ainsi que la démonstration du fonctionnement de l’outil, seront détaillés au chapitre 4 à l’issue du stage.</w:t>
       </w:r>
     </w:p>
     <w:p>
@@ -1847,7 +1847,7 @@
         <w:jc w:val="both"/>
       </w:pPr>
       <w:r>
-        <w:t xml:space="preserve">Dans le cadre de la formation d’ingénieur en Informatique et Réseaux à l’École Marocaine des Sciences de l’Ingénieur (EMSI), les étudiants doivent effectuer un stage de perfectionnement en entreprise afin de mettre en pratique leurs connaissances théoriques dans un contexte professionnel réel. C’est dans ce cadre que ce stage de deux mois s’est déroulé au sein du département Informatique du Mövenpick Hôtel de Tanger. Ce rapport présente, dans un premier chapitre, l’entreprise d’accueil ainsi que son environnement. Le deuxième chapitre décrit le département d’attache et la mission confiée durant le stage. Enfin, le troisième chapitre détaille la réalisation du projet ainsi que les résultats obtenus.</w:t>
+        <w:t xml:space="preserve">Dans le cadre de la formation d’ingénieur en Informatique et Réseaux à l’École Marocaine des Sciences de l’Ingénieur (EMSI), les étudiants doivent effectuer un stage de perfectionnement en entreprise afin de mettre en pratique leurs connaissances théoriques dans un contexte professionnel réel. C’est dans ce cadre que ce stage de deux mois s’est déroulé au sein du département Informatique du Mövenpick Hôtel de Tanger. Ce rapport s’organise en quatre chapitres. Le premier présente l’entreprise d’accueil, son environnement, le département d’attache ainsi que la mission confiée durant le stage. Le deuxième décrit la méthodologie de travail suivie : analyse du besoin, cahier des charges et technologies retenues. Le troisième détaille la modélisation du système à travers les différents diagrammes ainsi que l’organisation du travail (planning et suivi des tâches). Le quatrième présente, à travers des captures d’écran, les résultats obtenus et le fonctionnement réel de l’outil développé.</w:t>
       </w:r>
     </w:p>
     <w:p>
@@ -1973,138 +1973,26 @@
     </w:p>
     <w:p>
       <w:pPr>
-        <w:ind w:right="17"/>
-        <w:jc w:val="both"/>
-        <w:rPr>
-          <w:rFonts w:ascii="Segoe UI" w:hAnsi="Segoe UI" w:cs="Segoe UI"/>
-          <w:sz w:val="20"/>
-          <w:szCs w:val="20"/>
-        </w:rPr>
-      </w:pPr>
-      <w:r>
-        <w:rPr>
-          <w:rFonts w:ascii="Segoe UI" w:hAnsi="Segoe UI" w:cs="Segoe UI"/>
-          <w:noProof/>
-          <w:sz w:val="20"/>
-          <w:szCs w:val="20"/>
+        <w:pStyle w:val="Titre1"/>
+        <w:pageBreakBefore/>
+        <w:pBdr>
+          <w:top w:val="single" w:sz="24" w:space="8" w:color="4F6228" w:themeColor="accent3" w:themeShade="80"/>
+          <w:bottom w:val="single" w:sz="24" w:space="8" w:color="4F6228" w:themeColor="accent3" w:themeShade="80"/>
+        </w:pBdr>
+        <w:rPr>
+          <w:b/>
+          <w:bCs/>
+        </w:rPr>
+      </w:pPr>
+      <w:r>
+        <w:rPr>
+          <w:b/>
+          <w:bCs/>
         </w:rPr>
         <w:lastRenderedPageBreak/>
-        <mc:AlternateContent>
-          <mc:Choice Requires="wps">
-            <w:drawing>
-              <wp:anchor distT="91440" distB="91440" distL="114300" distR="114300" simplePos="0" relativeHeight="251713536" behindDoc="0" locked="0" layoutInCell="1" allowOverlap="1" wp14:anchorId="203FF09D" wp14:editId="7B931BF1">
-                <wp:simplePos x="0" y="0"/>
-                <wp:positionH relativeFrom="margin">
-                  <wp:align>left</wp:align>
-                </wp:positionH>
-                <wp:positionV relativeFrom="paragraph">
-                  <wp:posOffset>7620</wp:posOffset>
-                </wp:positionV>
-                <wp:extent cx="5690235" cy="1446530"/>
-                <wp:effectExtent l="0" t="0" r="0" b="1270"/>
-                <wp:wrapTopAndBottom/>
-                <wp:docPr id="307" name="Text Box 2"/>
-                <wp:cNvGraphicFramePr>
-                  <a:graphicFrameLocks xmlns:a="http://schemas.openxmlformats.org/drawingml/2006/main"/>
-                </wp:cNvGraphicFramePr>
-                <a:graphic xmlns:a="http://schemas.openxmlformats.org/drawingml/2006/main">
-                  <a:graphicData uri="http://schemas.microsoft.com/office/word/2010/wordprocessingShape">
-                    <wps:wsp>
-                      <wps:cNvSpPr txBox="1">
-                        <a:spLocks noChangeArrowheads="1"/>
-                      </wps:cNvSpPr>
-                      <wps:spPr bwMode="auto">
-                        <a:xfrm>
-                          <a:off x="0" y="0"/>
-                          <a:ext cx="5690235" cy="1446530"/>
-                        </a:xfrm>
-                        <a:prstGeom prst="rect">
-                          <a:avLst/>
-                        </a:prstGeom>
-                        <a:noFill/>
-                        <a:ln w="9525">
-                          <a:noFill/>
-                          <a:miter lim="800000"/>
-                          <a:headEnd/>
-                          <a:tailEnd/>
-                        </a:ln>
-                      </wps:spPr>
-                      <wps:txbx>
-                        <w:txbxContent>
-                          <w:p>
-                            <w:pPr>
-                              <w:pStyle w:val="Titre1"/>
-                              <w:pBdr>
-                                <w:top w:val="single" w:sz="24" w:space="8" w:color="4F6228" w:themeColor="accent3" w:themeShade="80"/>
-                                <w:bottom w:val="single" w:sz="24" w:space="8" w:color="4F6228" w:themeColor="accent3" w:themeShade="80"/>
-                              </w:pBdr>
-                              <w:rPr>
-                                <w:b/>
-                                <w:bCs/>
-                              </w:rPr>
-                            </w:pPr>
-                            <w:bookmarkStart w:id="3" w:name="_Toc141784015"/>
-                            <w:r>
-                              <w:rPr>
-                                <w:b/>
-                                <w:bCs/>
-                              </w:rPr>
-                              <w:t xml:space="preserve">Chapitre 1 : Présentation de l’entreprise</w:t>
-                            </w:r>
-                            <w:bookmarkEnd w:id="3"/>
-                          </w:p>
-                        </w:txbxContent>
-                      </wps:txbx>
-                      <wps:bodyPr rot="0" vert="horz" wrap="square" lIns="91440" tIns="45720" rIns="91440" bIns="45720" anchor="t" anchorCtr="0">
-                        <a:noAutofit/>
-                      </wps:bodyPr>
-                    </wps:wsp>
-                  </a:graphicData>
-                </a:graphic>
-                <wp14:sizeRelH relativeFrom="margin">
-                  <wp14:pctWidth>0</wp14:pctWidth>
-                </wp14:sizeRelH>
-                <wp14:sizeRelV relativeFrom="margin">
-                  <wp14:pctHeight>0</wp14:pctHeight>
-                </wp14:sizeRelV>
-              </wp:anchor>
-            </w:drawing>
-          </mc:Choice>
-          <mc:Fallback>
-            <w:pict>
-              <v:shape w14:anchorId="203FF09D" id="_x0000_s1029" type="#_x0000_t202" style="position:absolute;left:0;text-align:left;margin-left:0;margin-top:.6pt;width:448.05pt;height:113.9pt;z-index:251713536;visibility:visible;mso-wrap-style:square;mso-width-percent:0;mso-height-percent:0;mso-wrap-distance-left:9pt;mso-wrap-distance-top:7.2pt;mso-wrap-distance-right:9pt;mso-wrap-distance-bottom:7.2pt;mso-position-horizontal:left;mso-position-horizontal-relative:margin;mso-position-vertical:absolute;mso-position-vertical-relative:text;mso-width-percent:0;mso-height-percent:0;mso-width-relative:margin;mso-height-relative:margin;v-text-anchor:top" o:gfxdata="UEsDBBQABgAIAAAAIQC2gziS/gAAAOEBAAATAAAAW0NvbnRlbnRfVHlwZXNdLnhtbJSRQU7DMBBF 90jcwfIWJU67QAgl6YK0S0CoHGBkTxKLZGx5TGhvj5O2G0SRWNoz/78nu9wcxkFMGNg6quQqL6RA 0s5Y6ir5vt9lD1JwBDIwOMJKHpHlpr69KfdHjyxSmriSfYz+USnWPY7AufNIadK6MEJMx9ApD/oD OlTrorhX2lFEilmcO2RdNtjC5xDF9pCuTyYBB5bi6bQ4syoJ3g9WQ0ymaiLzg5KdCXlKLjvcW893 SUOqXwnz5DrgnHtJTxOsQfEKIT7DmDSUCaxw7Rqn8787ZsmRM9e2VmPeBN4uqYvTtW7jvijg9N/y JsXecLq0q+WD6m8AAAD//wMAUEsDBBQABgAIAAAAIQA4/SH/1gAAAJQBAAALAAAAX3JlbHMvLnJl bHOkkMFqwzAMhu+DvYPRfXGawxijTi+j0GvpHsDYimMaW0Yy2fr2M4PBMnrbUb/Q94l/f/hMi1qR JVI2sOt6UJgd+ZiDgffL8ekFlFSbvV0oo4EbChzGx4f9GRdb25HMsYhqlCwG5lrLq9biZkxWOiqY 22YiTra2kYMu1l1tQD30/bPm3wwYN0x18gb45AdQl1tp5j/sFB2T0FQ7R0nTNEV3j6o9feQzro1i OWA14Fm+Q8a1a8+Bvu/d/dMb2JY5uiPbhG/ktn4cqGU/er3pcvwCAAD//wMAUEsDBBQABgAIAAAA IQBV+6kk/QEAANUDAAAOAAAAZHJzL2Uyb0RvYy54bWysU9uO2yAQfa/Uf0C8N3YuTjdWyGq7260q bS/Sbj+AYByjAkOBxE6/vgPOZqP2bVU/IIbxHOacOayvB6PJQfqgwDI6nZSUSCugUXbH6I+n+3dX lITIbcM1WMnoUQZ6vXn7Zt27Ws6gA91ITxDEhrp3jHYxurooguik4WECTlpMtuANjxj6XdF43iO6 0cWsLJdFD75xHoQMAU/vxiTdZPy2lSJ+a9sgI9GMYm8xrz6v27QWmzWvd567TolTG/wVXRiuLF56 hrrjkZO9V/9AGSU8BGjjRIApoG2VkJkDspmWf7F57LiTmQuKE9xZpvD/YMXXw6P77kkcPsCAA8wk gnsA8TMQC7cdtzt54z30neQNXjxNkhW9C/WpNEkd6pBAtv0XaHDIfB8hAw2tN0kV5EkQHQdwPIsu h0gEHlbLVTmbV5QIzE0Xi2U1z2MpeP1c7nyInyQYkjaMepxqhueHhxBTO7x+/iXdZuFeaZ0nqy3p GV1VsyoXXGSMimg8rQyjV2X6Risklh9tk4sjV3rc4wXanmgnpiPnOGwHohpG56k2qbCF5og6eBh9 hu8CNx3435T06DFGw68995IS/dmiliukm0yZg0X1foaBv8xsLzPcCoRiNFIybm9jNvJI+QY1b1VW 46WTU8vonSzSyefJnJdx/uvlNW7+AAAA//8DAFBLAwQUAAYACAAAACEA0Xp5idsAAAAGAQAADwAA AGRycy9kb3ducmV2LnhtbEyPzU7DMBCE70i8g7VI3KjdCKomjVMhEFcQ5UfqbRtvk4h4HcVuE96e 5QTHnRnNfFtuZ9+rM42xC2xhuTCgiOvgOm4svL893axBxYTssA9MFr4pwra6vCixcGHiVzrvUqOk hGOBFtqUhkLrWLfkMS7CQCzeMYwek5xjo92Ik5T7XmfGrLTHjmWhxYEeWqq/didv4eP5uP+8NS/N o78bpjAbzT7X1l5fzfcbUInm9BeGX3xBh0qYDuHELqregjySRM1AibnOV0tQBwtZlhvQVan/41c/ AAAA//8DAFBLAQItABQABgAIAAAAIQC2gziS/gAAAOEBAAATAAAAAAAAAAAAAAAAAAAAAABbQ29u dGVudF9UeXBlc10ueG1sUEsBAi0AFAAGAAgAAAAhADj9If/WAAAAlAEAAAsAAAAAAAAAAAAAAAAA LwEAAF9yZWxzLy5yZWxzUEsBAi0AFAAGAAgAAAAhAFX7qST9AQAA1QMAAA4AAAAAAAAAAAAAAAAA LgIAAGRycy9lMm9Eb2MueG1sUEsBAi0AFAAGAAgAAAAhANF6eYnbAAAABgEAAA8AAAAAAAAAAAAA AAAAVwQAAGRycy9kb3ducmV2LnhtbFBLBQYAAAAABAAEAPMAAABfBQAAAAA= " filled="f" stroked="f">
-                <v:textbox>
-                  <w:txbxContent>
-                    <w:p>
-                      <w:pPr>
-                        <w:pStyle w:val="Titre1"/>
-                        <w:pBdr>
-                          <w:top w:val="single" w:sz="24" w:space="8" w:color="4F6228" w:themeColor="accent3" w:themeShade="80"/>
-                          <w:bottom w:val="single" w:sz="24" w:space="8" w:color="4F6228" w:themeColor="accent3" w:themeShade="80"/>
-                        </w:pBdr>
-                        <w:rPr>
-                          <w:b/>
-                          <w:bCs/>
-                        </w:rPr>
-                      </w:pPr>
-                      <w:bookmarkStart w:id="4" w:name="_Toc141784015"/>
-                      <w:r>
-                        <w:rPr>
-                          <w:b/>
-                          <w:bCs/>
-                        </w:rPr>
-                        <w:t xml:space="preserve">Chapitre 1 : Présentation de l’entreprise</w:t>
-                      </w:r>
-                      <w:bookmarkEnd w:id="4"/>
-                    </w:p>
-                  </w:txbxContent>
-                </v:textbox>
-                <w10:wrap type="topAndBottom" anchorx="margin"/>
-              </v:shape>
-            </w:pict>
-          </mc:Fallback>
-        </mc:AlternateContent>
-      </w:r>
+        <w:t xml:space="preserve">Chapitre 1 : Présentation de l’entreprise et du contexte du stage</w:t>
+      </w:r>
+      <w:bookmarkEnd w:id="11"/>
     </w:p>
     <w:p>
       <w:pPr>
@@ -2146,7 +2034,7 @@
           <w:rStyle w:val="ListLabel78"/>
           <w:rFonts w:asciiTheme="majorBidi" w:hAnsiTheme="majorBidi" w:cstheme="majorBidi"/>
         </w:rPr>
-        <w:t xml:space="preserve">Ce chapitre présente l’entreprise d’accueil, Mövenpick Hôtel de Tanger, son secteur d’activité, son historique, son organisation interne ainsi que son environnement (clientèle, fournisseurs, concurrence).</w:t>
+        <w:t xml:space="preserve">Ce chapitre présente l’entreprise d’accueil, Mövenpick Hôtel de Tanger, son secteur d’activité, son historique, son organisation interne ainsi que son environnement (clientèle, fournisseurs, concurrence). Il présente également le département Informatique (IT) au sein duquel le stage s’est déroulé, son rôle dans l’organisation de l’hôtel, ainsi que la mission confiée à l’étudiant durant ces deux mois.</w:t>
       </w:r>
     </w:p>
     <w:bookmarkEnd w:id="4"/>
@@ -2426,161 +2314,6 @@
     </w:p>
     <w:p>
       <w:pPr>
-        <w:ind w:right="17"/>
-        <w:jc w:val="both"/>
-        <w:rPr>
-          <w:rFonts w:ascii="Segoe UI" w:hAnsi="Segoe UI" w:cs="Segoe UI"/>
-          <w:bCs/>
-          <w:sz w:val="20"/>
-          <w:szCs w:val="20"/>
-        </w:rPr>
-      </w:pPr>
-      <w:r>
-        <w:rPr>
-          <w:rFonts w:ascii="Segoe UI" w:hAnsi="Segoe UI" w:cs="Segoe UI"/>
-          <w:noProof/>
-          <w:sz w:val="20"/>
-          <w:szCs w:val="20"/>
-        </w:rPr>
-        <w:lastRenderedPageBreak/>
-        <mc:AlternateContent>
-          <mc:Choice Requires="wps">
-            <w:drawing>
-              <wp:anchor distT="91440" distB="91440" distL="114300" distR="114300" simplePos="0" relativeHeight="251715584" behindDoc="0" locked="0" layoutInCell="1" allowOverlap="1" wp14:anchorId="07A72629" wp14:editId="6AE02074">
-                <wp:simplePos x="0" y="0"/>
-                <wp:positionH relativeFrom="page">
-                  <wp:align>center</wp:align>
-                </wp:positionH>
-                <wp:positionV relativeFrom="paragraph">
-                  <wp:posOffset>0</wp:posOffset>
-                </wp:positionV>
-                <wp:extent cx="5711190" cy="1605915"/>
-                <wp:effectExtent l="0" t="0" r="0" b="0"/>
-                <wp:wrapTopAndBottom/>
-                <wp:docPr id="21961961" name="Text Box 2"/>
-                <wp:cNvGraphicFramePr>
-                  <a:graphicFrameLocks xmlns:a="http://schemas.openxmlformats.org/drawingml/2006/main"/>
-                </wp:cNvGraphicFramePr>
-                <a:graphic xmlns:a="http://schemas.openxmlformats.org/drawingml/2006/main">
-                  <a:graphicData uri="http://schemas.microsoft.com/office/word/2010/wordprocessingShape">
-                    <wps:wsp>
-                      <wps:cNvSpPr txBox="1">
-                        <a:spLocks noChangeArrowheads="1"/>
-                      </wps:cNvSpPr>
-                      <wps:spPr bwMode="auto">
-                        <a:xfrm>
-                          <a:off x="0" y="0"/>
-                          <a:ext cx="5711190" cy="1606164"/>
-                        </a:xfrm>
-                        <a:prstGeom prst="rect">
-                          <a:avLst/>
-                        </a:prstGeom>
-                        <a:noFill/>
-                        <a:ln w="9525">
-                          <a:noFill/>
-                          <a:miter lim="800000"/>
-                          <a:headEnd/>
-                          <a:tailEnd/>
-                        </a:ln>
-                      </wps:spPr>
-                      <wps:txbx>
-                        <w:txbxContent>
-                          <w:p>
-                            <w:pPr>
-                              <w:pStyle w:val="Titre1"/>
-                              <w:pBdr>
-                                <w:top w:val="single" w:sz="24" w:space="8" w:color="4F6228" w:themeColor="accent3" w:themeShade="80"/>
-                                <w:bottom w:val="single" w:sz="24" w:space="8" w:color="4F6228" w:themeColor="accent3" w:themeShade="80"/>
-                              </w:pBdr>
-                              <w:rPr>
-                                <w:b/>
-                                <w:bCs/>
-                              </w:rPr>
-                            </w:pPr>
-                            <w:bookmarkStart w:id="10" w:name="_Toc141784016"/>
-                            <w:r>
-                              <w:rPr>
-                                <w:b/>
-                                <w:bCs/>
-                              </w:rPr>
-                              <w:t xml:space="preserve">Chapitre 2 : Département d’attache et mission</w:t>
-                            </w:r>
-                            <w:bookmarkEnd w:id="10"/>
-                          </w:p>
-                        </w:txbxContent>
-                      </wps:txbx>
-                      <wps:bodyPr rot="0" vert="horz" wrap="square" lIns="91440" tIns="45720" rIns="91440" bIns="45720" anchor="t" anchorCtr="0">
-                        <a:noAutofit/>
-                      </wps:bodyPr>
-                    </wps:wsp>
-                  </a:graphicData>
-                </a:graphic>
-                <wp14:sizeRelH relativeFrom="margin">
-                  <wp14:pctWidth>0</wp14:pctWidth>
-                </wp14:sizeRelH>
-                <wp14:sizeRelV relativeFrom="margin">
-                  <wp14:pctHeight>0</wp14:pctHeight>
-                </wp14:sizeRelV>
-              </wp:anchor>
-            </w:drawing>
-          </mc:Choice>
-          <mc:Fallback>
-            <w:pict>
-              <v:shape w14:anchorId="07A72629" id="_x0000_s1030" type="#_x0000_t202" style="position:absolute;left:0;text-align:left;margin-left:0;margin-top:0;width:449.7pt;height:126.45pt;z-index:251715584;visibility:visible;mso-wrap-style:square;mso-width-percent:0;mso-height-percent:0;mso-wrap-distance-left:9pt;mso-wrap-distance-top:7.2pt;mso-wrap-distance-right:9pt;mso-wrap-distance-bottom:7.2pt;mso-position-horizontal:center;mso-position-horizontal-relative:page;mso-position-vertical:absolute;mso-position-vertical-relative:text;mso-width-percent:0;mso-height-percent:0;mso-width-relative:margin;mso-height-relative:margin;v-text-anchor:top" o:gfxdata="UEsDBBQABgAIAAAAIQC2gziS/gAAAOEBAAATAAAAW0NvbnRlbnRfVHlwZXNdLnhtbJSRQU7DMBBF 90jcwfIWJU67QAgl6YK0S0CoHGBkTxKLZGx5TGhvj5O2G0SRWNoz/78nu9wcxkFMGNg6quQqL6RA 0s5Y6ir5vt9lD1JwBDIwOMJKHpHlpr69KfdHjyxSmriSfYz+USnWPY7AufNIadK6MEJMx9ApD/oD OlTrorhX2lFEilmcO2RdNtjC5xDF9pCuTyYBB5bi6bQ4syoJ3g9WQ0ymaiLzg5KdCXlKLjvcW893 SUOqXwnz5DrgnHtJTxOsQfEKIT7DmDSUCaxw7Rqn8787ZsmRM9e2VmPeBN4uqYvTtW7jvijg9N/y JsXecLq0q+WD6m8AAAD//wMAUEsDBBQABgAIAAAAIQA4/SH/1gAAAJQBAAALAAAAX3JlbHMvLnJl bHOkkMFqwzAMhu+DvYPRfXGawxijTi+j0GvpHsDYimMaW0Yy2fr2M4PBMnrbUb/Q94l/f/hMi1qR JVI2sOt6UJgd+ZiDgffL8ekFlFSbvV0oo4EbChzGx4f9GRdb25HMsYhqlCwG5lrLq9biZkxWOiqY 22YiTra2kYMu1l1tQD30/bPm3wwYN0x18gb45AdQl1tp5j/sFB2T0FQ7R0nTNEV3j6o9feQzro1i OWA14Fm+Q8a1a8+Bvu/d/dMb2JY5uiPbhG/ktn4cqGU/er3pcvwCAAD//wMAUEsDBBQABgAIAAAA IQBgspLn/AEAANUDAAAOAAAAZHJzL2Uyb0RvYy54bWysU9Fu2yAUfZ+0f0C8L7ajJG2skKpr12lS 103q9gEE4xgNuAxI7Ozrd8FuGm1v0/yAuFxz7j3nHjY3g9HkKH1QYBmtZiUl0gpolN0z+v3bw7tr SkLktuEarGT0JAO92b59s+ldLefQgW6kJwhiQ907RrsYXV0UQXTS8DADJy0mW/CGRwz9vmg87xHd 6GJelquiB984D0KGgKf3Y5JuM37bShG/tG2QkWhGsbeYV5/XXVqL7YbXe89dp8TUBv+HLgxXFoue oe555OTg1V9QRgkPAdo4E2AKaFslZOaAbKryDzbPHXcyc0FxgjvLFP4frHg6PruvnsThPQw4wEwi uEcQPwKxcNdxu5e33kPfSd5g4SpJVvQu1NPVJHWoQwLZ9Z+hwSHzQ4QMNLTeJFWQJ0F0HMDpLLoc IhF4uLyqqmqNKYG5alWuqtUi1+D1y3XnQ/wowZC0YdTjVDM8Pz6GmNrh9csvqZqFB6V1nqy2pGd0 vZwv84WLjFERjaeVYfS6TN9ohcTyg23y5ciVHvdYQNuJdmI6co7DbiCqYTT3m1TYQXNCHTyMPsN3 gZsO/C9KevQYo+HngXtJif5kUct1tVgkU+ZgsbyaY+AvM7vLDLcCoRiNlIzbu5iNPFK+Rc1bldV4 7WRqGb2TRZp8nsx5Gee/Xl/j9jcAAAD//wMAUEsDBBQABgAIAAAAIQA0EPiD2gAAAAUBAAAPAAAA ZHJzL2Rvd25yZXYueG1sTI9BS8NAEIXvgv9hGcGbnTW00sRsiiheFVsVvG2z0ySYnQ3ZbRP/vaMX vQw83uO9b8rN7Ht1ojF2gQ1cLzQo4jq4jhsDr7vHqzWomCw72wcmA18UYVOdn5W2cGHiFzptU6Ok hGNhDbQpDQVirFvyNi7CQCzeIYzeJpFjg260k5T7HjOtb9DbjmWhtQPdt1R/bo/ewNvT4eN9qZ+b B78apjBrZJ+jMZcX890tqERz+gvDD76gQyVM+3BkF1VvQB5Jv1e8dZ4vQe0NZKssB6xK/E9ffQMA AP//AwBQSwECLQAUAAYACAAAACEAtoM4kv4AAADhAQAAEwAAAAAAAAAAAAAAAAAAAAAAW0NvbnRl bnRfVHlwZXNdLnhtbFBLAQItABQABgAIAAAAIQA4/SH/1gAAAJQBAAALAAAAAAAAAAAAAAAAAC8B AABfcmVscy8ucmVsc1BLAQItABQABgAIAAAAIQBgspLn/AEAANUDAAAOAAAAAAAAAAAAAAAAAC4C AABkcnMvZTJvRG9jLnhtbFBLAQItABQABgAIAAAAIQA0EPiD2gAAAAUBAAAPAAAAAAAAAAAAAAAA AFYEAABkcnMvZG93bnJldi54bWxQSwUGAAAAAAQABADzAAAAXQUAAAAA " filled="f" stroked="f">
-                <v:textbox>
-                  <w:txbxContent>
-                    <w:p>
-                      <w:pPr>
-                        <w:pStyle w:val="Titre1"/>
-                        <w:pBdr>
-                          <w:top w:val="single" w:sz="24" w:space="8" w:color="4F6228" w:themeColor="accent3" w:themeShade="80"/>
-                          <w:bottom w:val="single" w:sz="24" w:space="8" w:color="4F6228" w:themeColor="accent3" w:themeShade="80"/>
-                        </w:pBdr>
-                        <w:rPr>
-                          <w:b/>
-                          <w:bCs/>
-                        </w:rPr>
-                      </w:pPr>
-                      <w:bookmarkStart w:id="12" w:name="_Toc141784016"/>
-                      <w:r>
-                        <w:rPr>
-                          <w:b/>
-                          <w:bCs/>
-                        </w:rPr>
-                        <w:t xml:space="preserve">Chapitre 2 : Département d’attache et mission</w:t>
-                      </w:r>
-                      <w:bookmarkEnd w:id="12"/>
-                    </w:p>
-                  </w:txbxContent>
-                </v:textbox>
-                <w10:wrap type="topAndBottom" anchorx="page"/>
-              </v:shape>
-            </w:pict>
-          </mc:Fallback>
-        </mc:AlternateContent>
-      </w:r>
-    </w:p>
-    <w:p>
-      <w:pPr>
-        <w:pBdr>
-          <w:bottom w:val="single" w:sz="6" w:space="1" w:color="auto"/>
-        </w:pBdr>
-        <w:spacing w:before="240" w:after="240"/>
-        <w:rPr>
-          <w:b/>
-          <w:bCs/>
-        </w:rPr>
-      </w:pPr>
-      <w:r>
-        <w:rPr>
-          <w:b/>
-          <w:bCs/>
-        </w:rPr>
-        <w:t>Résumé </w:t>
-      </w:r>
-    </w:p>
-    <w:p>
-      <w:pPr>
         <w:pStyle w:val="NormalWeb"/>
         <w:spacing w:before="240" w:line="276" w:lineRule="auto"/>
         <w:jc w:val="both"/>
@@ -2594,7 +2327,7 @@
           <w:rStyle w:val="ListLabel78"/>
           <w:rFonts w:asciiTheme="majorBidi" w:hAnsiTheme="majorBidi" w:cstheme="majorBidi"/>
         </w:rPr>
-        <w:t xml:space="preserve">Ce chapitre présente le département Informatique (IT), son rôle au sein de l’hôtel, ainsi que la mission confiée à l’étudiant durant ce stage.</w:t>
+        <w:t xml:space="preserve">La seconde partie de ce chapitre présente plus en détail le département Informatique (IT), son rôle au sein de l’hôtel, ainsi que la mission confiée à l’étudiant durant ce stage.</w:t>
       </w:r>
     </w:p>
     <w:p>
@@ -2858,6 +2591,7 @@
     <w:p>
       <w:pPr>
         <w:pStyle w:val="Titre1"/>
+        <w:pageBreakBefore/>
         <w:pBdr>
           <w:top w:val="single" w:sz="24" w:space="8" w:color="4F6228" w:themeColor="accent3" w:themeShade="80"/>
           <w:bottom w:val="single" w:sz="24" w:space="8" w:color="4F6228" w:themeColor="accent3" w:themeShade="80"/>
@@ -2874,7 +2608,7 @@
           <w:bCs/>
         </w:rPr>
         <w:lastRenderedPageBreak/>
-        <w:t xml:space="preserve">Chapitre 3 : Réalisation et Résultats</w:t>
+        <w:t xml:space="preserve">Chapitre 2 : Méthodologie de travail</w:t>
       </w:r>
       <w:bookmarkEnd w:id="11"/>
     </w:p>
@@ -2912,7 +2646,7 @@
           <w:rStyle w:val="ListLabel78"/>
           <w:rFonts w:asciiTheme="majorBidi" w:hAnsiTheme="majorBidi" w:cstheme="majorBidi"/>
         </w:rPr>
-        <w:t xml:space="preserve">Ce chapitre présente la réalisation du projet NetSentry : l’analyse du besoin, la conception, les outils et technologies utilisés, ainsi que les résultats obtenus. Cette partie sera complétée au fur et à mesure de l’avancement du stage.</w:t>
+        <w:t xml:space="preserve">Ce chapitre présente la méthodologie de travail suivie pour la réalisation du projet : l’analyse du besoin (exigences fonctionnelles et non fonctionnelles), le cahier des charges qui a cadré le stage, ainsi que les outils et technologies retenus.</w:t>
       </w:r>
     </w:p>
     <w:p>
@@ -2993,6 +2727,307 @@
         </w:rPr>
         <w:t>Sur le plan non fonctionnel, la solution devait rester simple d’utilisation pour du personnel non spécialisé en réseau, s’exécuter de manière autonome (scans planifiés) sans intervention manuelle systématique, et ne transmettre aucune donnée du réseau interne vers des services externes. Ces contraintes ont directement guidé les choix d’architecture et de conception détaillés dans les sections suivantes.</w:t>
       </w:r>
+    </w:p>
+    <w:p>
+      <w:pPr>
+        <w:pBdr>
+          <w:bottom w:val="single" w:sz="4" w:space="1" w:color="BFBFBF"/>
+        </w:pBdr>
+        <w:spacing w:before="240" w:after="120"/>
+        <w:rPr>
+          <w:b/>
+          <w:bCs/>
+          <w:sz w:val="26"/>
+          <w:szCs w:val="26"/>
+        </w:rPr>
+      </w:pPr>
+      <w:r>
+        <w:rPr>
+          <w:b/>
+          <w:bCs/>
+          <w:sz w:val="26"/>
+          <w:szCs w:val="26"/>
+        </w:rPr>
+        <w:t xml:space="preserve">Cahier des charges</w:t>
+      </w:r>
+    </w:p>
+    <w:p>
+      <w:pPr>
+        <w:spacing w:line="360" w:lineRule="auto"/>
+        <w:ind w:right="17"/>
+        <w:jc w:val="both"/>
+      </w:pPr>
+      <w:r>
+        <w:t xml:space="preserve">Le cadrage du projet a été formalisé dans un cahier des charges remis en début de stage, définissant le contexte, les objectifs, le périmètre fonctionnel et non fonctionnel, ainsi que les contraintes et livrables attendus.</w:t>
+      </w:r>
+    </w:p>
+    <w:p>
+      <w:pPr>
+        <w:spacing w:before="200" w:after="100"/>
+        <w:rPr>
+          <w:b/>
+          <w:bCs/>
+          <w:sz w:val="22"/>
+          <w:szCs w:val="22"/>
+        </w:rPr>
+      </w:pPr>
+      <w:r>
+        <w:rPr>
+          <w:b/>
+          <w:bCs/>
+          <w:sz w:val="22"/>
+          <w:szCs w:val="22"/>
+        </w:rPr>
+        <w:t xml:space="preserve">Livrables attendus</w:t>
+      </w:r>
+    </w:p>
+    <w:p>
+      <w:pPr>
+        <w:pStyle w:val="Paragraphedeliste"/>
+        <w:numPr>
+          <w:ilvl w:val="0"/>
+          <w:numId w:val="46"/>
+        </w:numPr>
+        <w:spacing w:line="360" w:lineRule="auto"/>
+        <w:ind w:right="17"/>
+      </w:pPr>
+      <w:r>
+        <w:t xml:space="preserve">Code source de l’application (backend, frontend, scripts de scan).</w:t>
+      </w:r>
+    </w:p>
+    <w:p>
+      <w:pPr>
+        <w:pStyle w:val="Paragraphedeliste"/>
+        <w:numPr>
+          <w:ilvl w:val="0"/>
+          <w:numId w:val="46"/>
+        </w:numPr>
+        <w:spacing w:line="360" w:lineRule="auto"/>
+        <w:ind w:right="17"/>
+      </w:pPr>
+      <w:r>
+        <w:t xml:space="preserve">Base de données structurée contenant l’historique des équipements détectés.</w:t>
+      </w:r>
+    </w:p>
+    <w:p>
+      <w:pPr>
+        <w:pStyle w:val="Paragraphedeliste"/>
+        <w:numPr>
+          <w:ilvl w:val="0"/>
+          <w:numId w:val="46"/>
+        </w:numPr>
+        <w:spacing w:line="360" w:lineRule="auto"/>
+        <w:ind w:right="17"/>
+      </w:pPr>
+      <w:r>
+        <w:t xml:space="preserve">Tableau de bord fonctionnel de visualisation.</w:t>
+      </w:r>
+    </w:p>
+    <w:p>
+      <w:pPr>
+        <w:pStyle w:val="Paragraphedeliste"/>
+        <w:numPr>
+          <w:ilvl w:val="0"/>
+          <w:numId w:val="46"/>
+        </w:numPr>
+        <w:spacing w:line="360" w:lineRule="auto"/>
+        <w:ind w:right="17"/>
+      </w:pPr>
+      <w:r>
+        <w:t xml:space="preserve">Image(s) Docker et instructions de déploiement.</w:t>
+      </w:r>
+    </w:p>
+    <w:p>
+      <w:pPr>
+        <w:pStyle w:val="Paragraphedeliste"/>
+        <w:numPr>
+          <w:ilvl w:val="0"/>
+          <w:numId w:val="46"/>
+        </w:numPr>
+        <w:spacing w:line="360" w:lineRule="auto"/>
+        <w:ind w:right="17"/>
+      </w:pPr>
+      <w:r>
+        <w:t xml:space="preserve">Documentation technique et rapport de stage détaillant la démarche, les choix techniques et les résultats obtenus.</w:t>
+      </w:r>
+    </w:p>
+    <w:p>
+      <w:pPr>
+        <w:spacing w:before="200" w:after="100"/>
+        <w:rPr>
+          <w:b/>
+          <w:bCs/>
+          <w:sz w:val="22"/>
+          <w:szCs w:val="22"/>
+        </w:rPr>
+      </w:pPr>
+      <w:r>
+        <w:rPr>
+          <w:b/>
+          <w:bCs/>
+          <w:sz w:val="22"/>
+          <w:szCs w:val="22"/>
+        </w:rPr>
+        <w:t xml:space="preserve">Contraintes</w:t>
+      </w:r>
+    </w:p>
+    <w:p>
+      <w:pPr>
+        <w:spacing w:line="360" w:lineRule="auto"/>
+        <w:ind w:right="17"/>
+        <w:jc w:val="both"/>
+      </w:pPr>
+      <w:r>
+        <w:t xml:space="preserve">Le projet devait être réalisé dans un délai de deux mois, avec un accès limité aux systèmes métiers de l’hôtel (gérés par un prestataire externe). Le scan réseau ne pouvait être exécuté que sur le réseau interne de l’hôtel, avec l’autorisation du département IT, et la solution devait privilégier une base de données relationnelle (SQL) en cohérence avec les outils disponibles côté hôtel.</w:t>
+      </w:r>
+    </w:p>
+    <w:p>
+      <w:pPr>
+        <w:pBdr>
+          <w:bottom w:val="single" w:sz="4" w:space="1" w:color="BFBFBF"/>
+        </w:pBdr>
+        <w:spacing w:before="240" w:after="120"/>
+        <w:rPr>
+          <w:b/>
+          <w:bCs/>
+          <w:sz w:val="26"/>
+          <w:szCs w:val="26"/>
+        </w:rPr>
+      </w:pPr>
+      <w:r>
+        <w:rPr>
+          <w:b/>
+          <w:bCs/>
+          <w:sz w:val="26"/>
+          <w:szCs w:val="26"/>
+        </w:rPr>
+        <w:t xml:space="preserve">Outils et Technologies</w:t>
+      </w:r>
+    </w:p>
+    <w:p>
+      <w:pPr>
+        <w:spacing w:before="200" w:after="100"/>
+        <w:rPr>
+          <w:b/>
+          <w:bCs/>
+          <w:sz w:val="22"/>
+          <w:szCs w:val="22"/>
+        </w:rPr>
+      </w:pPr>
+      <w:r>
+        <w:rPr>
+          <w:b/>
+          <w:bCs/>
+          <w:sz w:val="22"/>
+          <w:szCs w:val="22"/>
+        </w:rPr>
+        <w:t xml:space="preserve">Outils employés</w:t>
+      </w:r>
+    </w:p>
+    <w:p>
+      <w:pPr>
+        <w:spacing w:line="360" w:lineRule="auto"/>
+        <w:ind w:right="17"/>
+        <w:jc w:val="both"/>
+      </w:pPr>
+      <w:r>
+        <w:t xml:space="preserve">Les outils prévus pour ce projet sont : Node.js et Express pour le backend, une base de données SQL pour le stockage des équipements et de leur historique, Nmap pour la découverte réseau, ainsi que Docker pour la conteneurisation de l’application.</w:t>
+      </w:r>
+    </w:p>
+    <w:p>
+      <w:pPr>
+        <w:spacing w:before="200" w:after="100"/>
+        <w:rPr>
+          <w:b/>
+          <w:bCs/>
+          <w:sz w:val="22"/>
+          <w:szCs w:val="22"/>
+        </w:rPr>
+      </w:pPr>
+      <w:r>
+        <w:rPr>
+          <w:b/>
+          <w:bCs/>
+          <w:sz w:val="22"/>
+          <w:szCs w:val="22"/>
+        </w:rPr>
+        <w:t xml:space="preserve">Environnement de travail</w:t>
+      </w:r>
+    </w:p>
+    <w:p>
+      <w:pPr>
+        <w:spacing w:line="360" w:lineRule="auto"/>
+        <w:ind w:right="17"/>
+        <w:jc w:val="both"/>
+      </w:pPr>
+      <w:r>
+        <w:t xml:space="preserve">Le développement s’effectue en JavaScript (Node.js), avec un environnement de travail basé sur Visual Studio Code et un système de gestion de versions Git.</w:t>
+      </w:r>
+    </w:p>
+    <w:p>
+      <w:pPr>
+        <w:pStyle w:val="Titre1"/>
+        <w:pageBreakBefore/>
+        <w:pBdr>
+          <w:top w:val="single" w:sz="24" w:space="8" w:color="4F6228" w:themeColor="accent3" w:themeShade="80"/>
+          <w:bottom w:val="single" w:sz="24" w:space="8" w:color="4F6228" w:themeColor="accent3" w:themeShade="80"/>
+        </w:pBdr>
+        <w:rPr>
+          <w:b/>
+          <w:bCs/>
+        </w:rPr>
+      </w:pPr>
+      <w:r>
+        <w:rPr>
+          <w:b/>
+          <w:bCs/>
+        </w:rPr>
+        <w:lastRenderedPageBreak/>
+        <w:t xml:space="preserve">Chapitre 3 : Modélisation et diagrammes</w:t>
+      </w:r>
+      <w:bookmarkEnd w:id="11"/>
+    </w:p>
+    <w:p>
+      <w:pPr>
+        <w:pBdr>
+          <w:bottom w:val="single" w:sz="6" w:space="1" w:color="auto"/>
+        </w:pBdr>
+        <w:spacing w:before="240" w:after="240"/>
+        <w:rPr>
+          <w:b/>
+          <w:bCs/>
+        </w:rPr>
+      </w:pPr>
+      <w:r>
+        <w:rPr>
+          <w:b/>
+          <w:bCs/>
+        </w:rPr>
+        <w:t>Résumé </w:t>
+      </w:r>
+    </w:p>
+    <w:p>
+      <w:pPr>
+        <w:pStyle w:val="NormalWeb"/>
+        <w:spacing w:before="240" w:line="276" w:lineRule="auto"/>
+        <w:jc w:val="both"/>
+        <w:rPr>
+          <w:rStyle w:val="ListLabel78"/>
+          <w:rFonts w:asciiTheme="majorBidi" w:hAnsiTheme="majorBidi" w:cstheme="majorBidi"/>
+        </w:rPr>
+      </w:pPr>
+      <w:r>
+        <w:rPr>
+          <w:rStyle w:val="ListLabel78"/>
+          <w:rFonts w:asciiTheme="majorBidi" w:hAnsiTheme="majorBidi" w:cstheme="majorBidi"/>
+        </w:rPr>
+        <w:t xml:space="preserve">Ce chapitre présente la modélisation du système NetSentry (architecture réseau, diagramme de cas d’utilisation, diagramme de séquence et modèle conceptuel de données), ainsi que l’organisation du travail retenue pour la réalisation du projet (planning prévisionnel et suivi des tâches).</w:t>
+      </w:r>
+    </w:p>
+    <w:p>
+      <w:pPr>
+        <w:pStyle w:val="Default"/>
+      </w:pPr>
     </w:p>
     <w:p>
       <w:pPr>
@@ -3377,7 +3412,7 @@
           <w:sz w:val="26"/>
           <w:szCs w:val="26"/>
         </w:rPr>
-        <w:t xml:space="preserve">Outils et Technologies</w:t>
+        <w:t xml:space="preserve">Planification du projet</w:t>
       </w:r>
     </w:p>
     <w:p>
@@ -3397,7 +3432,7 @@
           <w:sz w:val="22"/>
           <w:szCs w:val="22"/>
         </w:rPr>
-        <w:t xml:space="preserve">Outils employés</w:t>
+        <w:t xml:space="preserve">Diagramme de Gantt</w:t>
       </w:r>
     </w:p>
     <w:p>
@@ -3407,8 +3442,65 @@
         <w:jc w:val="both"/>
       </w:pPr>
       <w:r>
-        <w:t xml:space="preserve">Les outils prévus pour ce projet sont : Node.js et Express pour le backend, une base de données SQL pour le stockage des équipements et de leur historique, Nmap pour la découverte réseau, ainsi que Docker pour la conteneurisation de l’application.</w:t>
-      </w:r>
+        <w:t xml:space="preserve">Le planning prévisionnel du stage, tel que défini dans le cahier des charges, répartit les huit semaines du stage en cinq grandes phases : prise en main de l’environnement réseau, conception et développement du backend, développement du tableau de bord, implémentation de la détection d’anomalies, puis conteneurisation et finalisation. La figure suivante illustre ce planning sous forme de diagramme de Gantt.</w:t>
+      </w:r>
+    </w:p>
+    <w:p>
+      <w:pPr>
+        <w:jc w:val="center"/>
+      </w:pPr>
+      <w:r>
+        <w:drawing>
+          <wp:inline xmlns:a="http://schemas.openxmlformats.org/drawingml/2006/main" xmlns:pic="http://schemas.openxmlformats.org/drawingml/2006/picture">
+            <wp:extent cx="5257800" cy="2025198"/>
+            <wp:docPr id="2088770739" name="Picture 2088770739"/>
+            <wp:cNvGraphicFramePr>
+              <a:graphicFrameLocks noChangeAspect="1"/>
+            </wp:cNvGraphicFramePr>
+            <a:graphic>
+              <a:graphicData uri="http://schemas.openxmlformats.org/drawingml/2006/picture">
+                <pic:pic>
+                  <pic:nvPicPr>
+                    <pic:cNvPr id="0" name="gantt.png"/>
+                    <pic:cNvPicPr/>
+                  </pic:nvPicPr>
+                  <pic:blipFill>
+                    <a:blip r:embed="rId34"/>
+                    <a:stretch>
+                      <a:fillRect/>
+                    </a:stretch>
+                  </pic:blipFill>
+                  <pic:spPr>
+                    <a:xfrm>
+                      <a:off x="0" y="0"/>
+                      <a:ext cx="5257800" cy="2025198"/>
+                    </a:xfrm>
+                    <a:prstGeom prst="rect"/>
+                  </pic:spPr>
+                </pic:pic>
+              </a:graphicData>
+            </a:graphic>
+          </wp:inline>
+        </w:drawing>
+      </w:r>
+    </w:p>
+    <w:p>
+      <w:pPr>
+        <w:spacing w:after="280"/>
+        <w:jc w:val="center"/>
+      </w:pPr>
+      <w:r>
+        <w:rPr>
+          <w:i/>
+          <w:sz w:val="20"/>
+        </w:rPr>
+        <w:t xml:space="preserve">Figure 5 – Diagramme de Gantt du planning prévisionnel du stage.</w:t>
+      </w:r>
+    </w:p>
+    <w:p>
+      <w:pPr>
+        <w:pStyle w:val="Default"/>
+      </w:pPr>
     </w:p>
     <w:p>
       <w:pPr>
@@ -3427,7 +3519,7 @@
           <w:sz w:val="22"/>
           <w:szCs w:val="22"/>
         </w:rPr>
-        <w:t xml:space="preserve">Environnement de travail</w:t>
+        <w:t xml:space="preserve">Organisation du travail (Scrum / Kanban)</w:t>
       </w:r>
     </w:p>
     <w:p>
@@ -3437,8 +3529,130 @@
         <w:jc w:val="both"/>
       </w:pPr>
       <w:r>
-        <w:t xml:space="preserve">Le développement s’effectue en JavaScript (Node.js), avec un environnement de travail basé sur Visual Studio Code et un système de gestion de versions Git.</w:t>
-      </w:r>
+        <w:t xml:space="preserve">Le suivi de l’avancement des tâches s’est appuyé sur une approche inspirée de Kanban, avec un tableau organisé en trois colonnes (à faire, en cours, terminé) permettant de visualiser l’état des différentes tâches du projet au fil du stage. La figure suivante présente l’état de ce tableau en fin de stage.</w:t>
+      </w:r>
+    </w:p>
+    <w:p>
+      <w:pPr>
+        <w:jc w:val="center"/>
+      </w:pPr>
+      <w:r>
+        <w:drawing>
+          <wp:inline xmlns:a="http://schemas.openxmlformats.org/drawingml/2006/main" xmlns:pic="http://schemas.openxmlformats.org/drawingml/2006/picture">
+            <wp:extent cx="5257800" cy="2831123"/>
+            <wp:docPr id="2088770740" name="Picture 2088770740"/>
+            <wp:cNvGraphicFramePr>
+              <a:graphicFrameLocks noChangeAspect="1"/>
+            </wp:cNvGraphicFramePr>
+            <a:graphic>
+              <a:graphicData uri="http://schemas.openxmlformats.org/drawingml/2006/picture">
+                <pic:pic>
+                  <pic:nvPicPr>
+                    <pic:cNvPr id="0" name="kanban.png"/>
+                    <pic:cNvPicPr/>
+                  </pic:nvPicPr>
+                  <pic:blipFill>
+                    <a:blip r:embed="rId35"/>
+                    <a:stretch>
+                      <a:fillRect/>
+                    </a:stretch>
+                  </pic:blipFill>
+                  <pic:spPr>
+                    <a:xfrm>
+                      <a:off x="0" y="0"/>
+                      <a:ext cx="5257800" cy="2831123"/>
+                    </a:xfrm>
+                    <a:prstGeom prst="rect"/>
+                  </pic:spPr>
+                </pic:pic>
+              </a:graphicData>
+            </a:graphic>
+          </wp:inline>
+        </w:drawing>
+      </w:r>
+    </w:p>
+    <w:p>
+      <w:pPr>
+        <w:spacing w:after="280"/>
+        <w:jc w:val="center"/>
+      </w:pPr>
+      <w:r>
+        <w:rPr>
+          <w:i/>
+          <w:sz w:val="20"/>
+        </w:rPr>
+        <w:t xml:space="preserve">Figure 6 – Organisation du travail selon la méthode Kanban.</w:t>
+      </w:r>
+    </w:p>
+    <w:p>
+      <w:pPr>
+        <w:pStyle w:val="Default"/>
+      </w:pPr>
+    </w:p>
+    <w:p>
+      <w:pPr>
+        <w:pStyle w:val="Titre1"/>
+        <w:pageBreakBefore/>
+        <w:pBdr>
+          <w:top w:val="single" w:sz="24" w:space="8" w:color="4F6228" w:themeColor="accent3" w:themeShade="80"/>
+          <w:bottom w:val="single" w:sz="24" w:space="8" w:color="4F6228" w:themeColor="accent3" w:themeShade="80"/>
+        </w:pBdr>
+        <w:rPr>
+          <w:b/>
+          <w:bCs/>
+        </w:rPr>
+      </w:pPr>
+      <w:r>
+        <w:rPr>
+          <w:b/>
+          <w:bCs/>
+        </w:rPr>
+        <w:lastRenderedPageBreak/>
+        <w:t xml:space="preserve">Chapitre 4 : Captures d’écran</w:t>
+      </w:r>
+      <w:bookmarkEnd w:id="11"/>
+    </w:p>
+    <w:p>
+      <w:pPr>
+        <w:pBdr>
+          <w:bottom w:val="single" w:sz="6" w:space="1" w:color="auto"/>
+        </w:pBdr>
+        <w:spacing w:before="240" w:after="240"/>
+        <w:rPr>
+          <w:b/>
+          <w:bCs/>
+        </w:rPr>
+      </w:pPr>
+      <w:r>
+        <w:rPr>
+          <w:b/>
+          <w:bCs/>
+        </w:rPr>
+        <w:t>Résumé </w:t>
+      </w:r>
+    </w:p>
+    <w:p>
+      <w:pPr>
+        <w:pStyle w:val="NormalWeb"/>
+        <w:spacing w:before="240" w:line="276" w:lineRule="auto"/>
+        <w:jc w:val="both"/>
+        <w:rPr>
+          <w:rStyle w:val="ListLabel78"/>
+          <w:rFonts w:asciiTheme="majorBidi" w:hAnsiTheme="majorBidi" w:cstheme="majorBidi"/>
+        </w:rPr>
+      </w:pPr>
+      <w:r>
+        <w:rPr>
+          <w:rStyle w:val="ListLabel78"/>
+          <w:rFonts w:asciiTheme="majorBidi" w:hAnsiTheme="majorBidi" w:cstheme="majorBidi"/>
+        </w:rPr>
+        <w:t xml:space="preserve">Ce chapitre présente, à travers des captures d’écran, le fonctionnement réel de l’outil NetSentry développé durant le stage : tableau de bord, détail d’un appareil, alertes, historique des scans, ainsi que l’historique de versionnage du projet sur GitHub.</w:t>
+      </w:r>
+    </w:p>
+    <w:p>
+      <w:pPr>
+        <w:pStyle w:val="Default"/>
+      </w:pPr>
     </w:p>
     <w:p>
       <w:pPr>
@@ -3555,7 +3769,7 @@
           <w:i/>
           <w:sz w:val="20"/>
         </w:rPr>
-        <w:t>Figure 5 – Tableau de bord : vue d’ensemble des appareils détectés sur le réseau.</w:t>
+        <w:t xml:space="preserve">Figure 7 – Tableau de bord : vue d’ensemble des appareils détectés sur le réseau.</w:t>
       </w:r>
     </w:p>
     <w:p/>
@@ -3610,7 +3824,7 @@
           <w:i/>
           <w:sz w:val="20"/>
         </w:rPr>
-        <w:t>Figure 6 – Détail d’un appareil : historique de détection et mise en liste blanche.</w:t>
+        <w:t xml:space="preserve">Figure 8 – Détail d’un appareil : historique de détection et mise en liste blanche.</w:t>
       </w:r>
     </w:p>
     <w:p/>
@@ -3665,7 +3879,7 @@
           <w:i/>
           <w:sz w:val="20"/>
         </w:rPr>
-        <w:t>Figure 7 – Alertes : appareils non reconnus signalés après un scan.</w:t>
+        <w:t xml:space="preserve">Figure 9 – Alertes : appareils non reconnus signalés après un scan.</w:t>
       </w:r>
     </w:p>
     <w:p/>
@@ -3720,7 +3934,7 @@
           <w:i/>
           <w:sz w:val="20"/>
         </w:rPr>
-        <w:t>Figure 8 – Historique des scans exécutés (manuels et planifiés).</w:t>
+        <w:t xml:space="preserve">Figure 10 – Historique des scans exécutés (manuels et planifiés).</w:t>
       </w:r>
     </w:p>
     <w:p/>
@@ -3816,7 +4030,7 @@
           <w:i/>
           <w:sz w:val="20"/>
         </w:rPr>
-        <w:t>Figure 9 – Historique des commits du dépôt GitHub NetSentry.</w:t>
+        <w:t xml:space="preserve">Figure 11 – Historique des commits du dépôt GitHub NetSentry.</w:t>
       </w:r>
     </w:p>
     <w:p/>

</xml_diff>